<commit_message>
Update Style Guide -Multiplayer Tank Game 25-26.docx
</commit_message>
<xml_diff>
--- a/Style Guide -Multiplayer Tank Game 25-26.docx
+++ b/Style Guide -Multiplayer Tank Game 25-26.docx
@@ -140,7 +140,7 @@
                                   <w:sdtContent>
                                     <w:p>
                                       <w:pPr>
-                                        <w:pStyle w:val="NoSpacing"/>
+                                        <w:pStyle w:val="Geenafstand"/>
                                         <w:spacing w:before="120"/>
                                         <w:jc w:val="center"/>
                                         <w:rPr>
@@ -158,7 +158,7 @@
                                 </w:sdt>
                                 <w:p>
                                   <w:pPr>
-                                    <w:pStyle w:val="NoSpacing"/>
+                                    <w:pStyle w:val="Geenafstand"/>
                                     <w:spacing w:before="120"/>
                                     <w:jc w:val="center"/>
                                     <w:rPr>
@@ -278,7 +278,7 @@
                                   <w:sdtContent>
                                     <w:p>
                                       <w:pPr>
-                                        <w:pStyle w:val="NoSpacing"/>
+                                        <w:pStyle w:val="Geenafstand"/>
                                         <w:jc w:val="center"/>
                                         <w:rPr>
                                           <w:rFonts w:asciiTheme="majorHAnsi" w:eastAsiaTheme="majorEastAsia" w:hAnsiTheme="majorHAnsi" w:cstheme="majorBidi"/>
@@ -343,7 +343,7 @@
                             <w:sdtContent>
                               <w:p>
                                 <w:pPr>
-                                  <w:pStyle w:val="NoSpacing"/>
+                                  <w:pStyle w:val="Geenafstand"/>
                                   <w:spacing w:before="120"/>
                                   <w:jc w:val="center"/>
                                   <w:rPr>
@@ -361,7 +361,7 @@
                           </w:sdt>
                           <w:p>
                             <w:pPr>
-                              <w:pStyle w:val="NoSpacing"/>
+                              <w:pStyle w:val="Geenafstand"/>
                               <w:spacing w:before="120"/>
                               <w:jc w:val="center"/>
                               <w:rPr>
@@ -447,7 +447,7 @@
                             <w:sdtContent>
                               <w:p>
                                 <w:pPr>
-                                  <w:pStyle w:val="NoSpacing"/>
+                                  <w:pStyle w:val="Geenafstand"/>
                                   <w:jc w:val="center"/>
                                   <w:rPr>
                                     <w:rFonts w:asciiTheme="majorHAnsi" w:eastAsiaTheme="majorEastAsia" w:hAnsiTheme="majorHAnsi" w:cstheme="majorBidi"/>
@@ -512,7 +512,7 @@
           <w:sdtContent>
             <w:p>
               <w:pPr>
-                <w:pStyle w:val="TOCHeading"/>
+                <w:pStyle w:val="Kopvaninhoudsopgave"/>
               </w:pPr>
               <w:r>
                 <w:t>Contents</w:t>
@@ -520,7 +520,7 @@
             </w:p>
             <w:p>
               <w:pPr>
-                <w:pStyle w:val="TOC2"/>
+                <w:pStyle w:val="Inhopg2"/>
                 <w:tabs>
                   <w:tab w:val="right" w:leader="dot" w:pos="9350"/>
                 </w:tabs>
@@ -599,7 +599,7 @@
             </w:p>
             <w:p>
               <w:pPr>
-                <w:pStyle w:val="TOC1"/>
+                <w:pStyle w:val="Inhopg1"/>
                 <w:tabs>
                   <w:tab w:val="right" w:leader="dot" w:pos="9350"/>
                 </w:tabs>
@@ -668,7 +668,7 @@
             </w:p>
             <w:p>
               <w:pPr>
-                <w:pStyle w:val="TOC2"/>
+                <w:pStyle w:val="Inhopg2"/>
                 <w:tabs>
                   <w:tab w:val="right" w:leader="dot" w:pos="9350"/>
                 </w:tabs>
@@ -737,7 +737,7 @@
             </w:p>
             <w:p>
               <w:pPr>
-                <w:pStyle w:val="TOC3"/>
+                <w:pStyle w:val="Inhopg3"/>
                 <w:tabs>
                   <w:tab w:val="right" w:leader="dot" w:pos="9350"/>
                 </w:tabs>
@@ -806,7 +806,7 @@
             </w:p>
             <w:p>
               <w:pPr>
-                <w:pStyle w:val="TOC2"/>
+                <w:pStyle w:val="Inhopg2"/>
                 <w:tabs>
                   <w:tab w:val="right" w:leader="dot" w:pos="9350"/>
                 </w:tabs>
@@ -876,7 +876,7 @@
             </w:p>
             <w:p>
               <w:pPr>
-                <w:pStyle w:val="TOC3"/>
+                <w:pStyle w:val="Inhopg3"/>
                 <w:tabs>
                   <w:tab w:val="right" w:leader="dot" w:pos="9350"/>
                 </w:tabs>
@@ -946,7 +946,7 @@
             </w:p>
             <w:p>
               <w:pPr>
-                <w:pStyle w:val="TOC2"/>
+                <w:pStyle w:val="Inhopg2"/>
                 <w:tabs>
                   <w:tab w:val="right" w:leader="dot" w:pos="9350"/>
                 </w:tabs>
@@ -1015,7 +1015,7 @@
             </w:p>
             <w:p>
               <w:pPr>
-                <w:pStyle w:val="TOC3"/>
+                <w:pStyle w:val="Inhopg3"/>
                 <w:tabs>
                   <w:tab w:val="right" w:leader="dot" w:pos="9350"/>
                 </w:tabs>
@@ -1084,7 +1084,7 @@
             </w:p>
             <w:p>
               <w:pPr>
-                <w:pStyle w:val="TOC3"/>
+                <w:pStyle w:val="Inhopg3"/>
                 <w:tabs>
                   <w:tab w:val="right" w:leader="dot" w:pos="9350"/>
                 </w:tabs>
@@ -1153,7 +1153,7 @@
             </w:p>
             <w:p>
               <w:pPr>
-                <w:pStyle w:val="TOC3"/>
+                <w:pStyle w:val="Inhopg3"/>
                 <w:tabs>
                   <w:tab w:val="right" w:leader="dot" w:pos="9350"/>
                 </w:tabs>
@@ -1222,7 +1222,7 @@
             </w:p>
             <w:p>
               <w:pPr>
-                <w:pStyle w:val="TOC3"/>
+                <w:pStyle w:val="Inhopg3"/>
                 <w:tabs>
                   <w:tab w:val="right" w:leader="dot" w:pos="9350"/>
                 </w:tabs>
@@ -1291,7 +1291,7 @@
             </w:p>
             <w:p>
               <w:pPr>
-                <w:pStyle w:val="TOC3"/>
+                <w:pStyle w:val="Inhopg3"/>
                 <w:tabs>
                   <w:tab w:val="right" w:leader="dot" w:pos="9350"/>
                 </w:tabs>
@@ -1360,7 +1360,7 @@
             </w:p>
             <w:p>
               <w:pPr>
-                <w:pStyle w:val="TOC2"/>
+                <w:pStyle w:val="Inhopg2"/>
                 <w:tabs>
                   <w:tab w:val="right" w:leader="dot" w:pos="9350"/>
                 </w:tabs>
@@ -1429,7 +1429,7 @@
             </w:p>
             <w:p>
               <w:pPr>
-                <w:pStyle w:val="TOC3"/>
+                <w:pStyle w:val="Inhopg3"/>
                 <w:tabs>
                   <w:tab w:val="right" w:leader="dot" w:pos="9350"/>
                 </w:tabs>
@@ -1498,7 +1498,7 @@
             </w:p>
             <w:p>
               <w:pPr>
-                <w:pStyle w:val="TOC3"/>
+                <w:pStyle w:val="Inhopg3"/>
                 <w:tabs>
                   <w:tab w:val="right" w:leader="dot" w:pos="9350"/>
                 </w:tabs>
@@ -1567,7 +1567,7 @@
             </w:p>
             <w:p>
               <w:pPr>
-                <w:pStyle w:val="TOC3"/>
+                <w:pStyle w:val="Inhopg3"/>
                 <w:tabs>
                   <w:tab w:val="right" w:leader="dot" w:pos="9350"/>
                 </w:tabs>
@@ -1636,7 +1636,7 @@
             </w:p>
             <w:p>
               <w:pPr>
-                <w:pStyle w:val="TOC2"/>
+                <w:pStyle w:val="Inhopg2"/>
                 <w:tabs>
                   <w:tab w:val="right" w:leader="dot" w:pos="9350"/>
                 </w:tabs>
@@ -1705,7 +1705,7 @@
             </w:p>
             <w:p>
               <w:pPr>
-                <w:pStyle w:val="TOC2"/>
+                <w:pStyle w:val="Inhopg2"/>
                 <w:tabs>
                   <w:tab w:val="right" w:leader="dot" w:pos="9350"/>
                 </w:tabs>
@@ -1774,7 +1774,7 @@
             </w:p>
             <w:p>
               <w:pPr>
-                <w:pStyle w:val="TOC2"/>
+                <w:pStyle w:val="Inhopg2"/>
                 <w:tabs>
                   <w:tab w:val="right" w:leader="dot" w:pos="9350"/>
                 </w:tabs>
@@ -1843,7 +1843,7 @@
             </w:p>
             <w:p>
               <w:pPr>
-                <w:pStyle w:val="TOC2"/>
+                <w:pStyle w:val="Inhopg2"/>
                 <w:tabs>
                   <w:tab w:val="right" w:leader="dot" w:pos="9350"/>
                 </w:tabs>
@@ -1912,7 +1912,7 @@
             </w:p>
             <w:p>
               <w:pPr>
-                <w:pStyle w:val="TOC2"/>
+                <w:pStyle w:val="Inhopg2"/>
                 <w:tabs>
                   <w:tab w:val="right" w:leader="dot" w:pos="9350"/>
                 </w:tabs>
@@ -1981,7 +1981,7 @@
             </w:p>
             <w:p>
               <w:pPr>
-                <w:pStyle w:val="TOC2"/>
+                <w:pStyle w:val="Inhopg2"/>
                 <w:tabs>
                   <w:tab w:val="right" w:leader="dot" w:pos="9350"/>
                 </w:tabs>
@@ -2050,7 +2050,7 @@
             </w:p>
             <w:p>
               <w:pPr>
-                <w:pStyle w:val="TOC2"/>
+                <w:pStyle w:val="Inhopg2"/>
                 <w:tabs>
                   <w:tab w:val="right" w:leader="dot" w:pos="9350"/>
                 </w:tabs>
@@ -2119,7 +2119,7 @@
             </w:p>
             <w:p>
               <w:pPr>
-                <w:pStyle w:val="TOC2"/>
+                <w:pStyle w:val="Inhopg2"/>
                 <w:tabs>
                   <w:tab w:val="right" w:leader="dot" w:pos="9350"/>
                 </w:tabs>
@@ -2188,7 +2188,7 @@
             </w:p>
             <w:p>
               <w:pPr>
-                <w:pStyle w:val="TOC2"/>
+                <w:pStyle w:val="Inhopg2"/>
                 <w:tabs>
                   <w:tab w:val="right" w:leader="dot" w:pos="9350"/>
                 </w:tabs>
@@ -2257,7 +2257,7 @@
             </w:p>
             <w:p>
               <w:pPr>
-                <w:pStyle w:val="TOC2"/>
+                <w:pStyle w:val="Inhopg2"/>
                 <w:tabs>
                   <w:tab w:val="right" w:leader="dot" w:pos="9350"/>
                 </w:tabs>
@@ -2326,7 +2326,7 @@
             </w:p>
             <w:p>
               <w:pPr>
-                <w:pStyle w:val="TOC2"/>
+                <w:pStyle w:val="Inhopg2"/>
                 <w:tabs>
                   <w:tab w:val="right" w:leader="dot" w:pos="9350"/>
                 </w:tabs>
@@ -2395,7 +2395,7 @@
             </w:p>
             <w:p>
               <w:pPr>
-                <w:pStyle w:val="TOC2"/>
+                <w:pStyle w:val="Inhopg2"/>
                 <w:tabs>
                   <w:tab w:val="right" w:leader="dot" w:pos="9350"/>
                 </w:tabs>
@@ -2464,7 +2464,7 @@
             </w:p>
             <w:p>
               <w:pPr>
-                <w:pStyle w:val="TOC2"/>
+                <w:pStyle w:val="Inhopg2"/>
                 <w:tabs>
                   <w:tab w:val="right" w:leader="dot" w:pos="9350"/>
                 </w:tabs>
@@ -2533,7 +2533,7 @@
             </w:p>
             <w:p>
               <w:pPr>
-                <w:pStyle w:val="TOC2"/>
+                <w:pStyle w:val="Inhopg2"/>
                 <w:tabs>
                   <w:tab w:val="right" w:leader="dot" w:pos="9350"/>
                 </w:tabs>
@@ -2602,7 +2602,7 @@
             </w:p>
             <w:p>
               <w:pPr>
-                <w:pStyle w:val="TOC2"/>
+                <w:pStyle w:val="Inhopg2"/>
                 <w:tabs>
                   <w:tab w:val="right" w:leader="dot" w:pos="9350"/>
                 </w:tabs>
@@ -2671,7 +2671,7 @@
             </w:p>
             <w:p>
               <w:pPr>
-                <w:pStyle w:val="TOC2"/>
+                <w:pStyle w:val="Inhopg2"/>
                 <w:tabs>
                   <w:tab w:val="right" w:leader="dot" w:pos="9350"/>
                 </w:tabs>
@@ -2740,7 +2740,7 @@
             </w:p>
             <w:p>
               <w:pPr>
-                <w:pStyle w:val="TOC2"/>
+                <w:pStyle w:val="Inhopg2"/>
                 <w:tabs>
                   <w:tab w:val="right" w:leader="dot" w:pos="9345"/>
                 </w:tabs>
@@ -2776,7 +2776,7 @@
     </w:p>
     <w:p>
       <w:pPr>
-        <w:pStyle w:val="Heading2"/>
+        <w:pStyle w:val="Kop2"/>
       </w:pPr>
       <w:bookmarkStart w:id="0" w:name="_Toc231933155"/>
       <w:r>
@@ -2794,7 +2794,7 @@
     </w:p>
     <w:p>
       <w:pPr>
-        <w:pStyle w:val="ListParagraph"/>
+        <w:pStyle w:val="Lijstalinea"/>
         <w:numPr>
           <w:ilvl w:val="0"/>
           <w:numId w:val="25"/>
@@ -2812,7 +2812,7 @@
     </w:p>
     <w:p>
       <w:pPr>
-        <w:pStyle w:val="ListParagraph"/>
+        <w:pStyle w:val="Lijstalinea"/>
         <w:numPr>
           <w:ilvl w:val="0"/>
           <w:numId w:val="25"/>
@@ -2830,7 +2830,7 @@
     </w:p>
     <w:p>
       <w:pPr>
-        <w:pStyle w:val="ListParagraph"/>
+        <w:pStyle w:val="Lijstalinea"/>
         <w:numPr>
           <w:ilvl w:val="0"/>
           <w:numId w:val="25"/>
@@ -2848,7 +2848,7 @@
     </w:p>
     <w:p>
       <w:pPr>
-        <w:pStyle w:val="ListParagraph"/>
+        <w:pStyle w:val="Lijstalinea"/>
         <w:numPr>
           <w:ilvl w:val="0"/>
           <w:numId w:val="25"/>
@@ -3085,7 +3085,7 @@
     </w:p>
     <w:p>
       <w:pPr>
-        <w:pStyle w:val="Heading1"/>
+        <w:pStyle w:val="Kop1"/>
       </w:pPr>
       <w:bookmarkStart w:id="1" w:name="_Toc231933156"/>
       <w:r>
@@ -3104,7 +3104,7 @@
     </w:p>
     <w:p>
       <w:pPr>
-        <w:pStyle w:val="Heading2"/>
+        <w:pStyle w:val="Kop2"/>
       </w:pPr>
       <w:bookmarkStart w:id="2" w:name="_Toc231933157"/>
       <w:proofErr w:type="spellStart"/>
@@ -3132,7 +3132,7 @@
     </w:p>
     <w:p>
       <w:pPr>
-        <w:pStyle w:val="Heading3"/>
+        <w:pStyle w:val="Kop3"/>
       </w:pPr>
       <w:bookmarkStart w:id="3" w:name="_Toc231933158"/>
       <w:r>
@@ -3142,7 +3142,7 @@
     </w:p>
     <w:p>
       <w:pPr>
-        <w:pStyle w:val="ListParagraph"/>
+        <w:pStyle w:val="Lijstalinea"/>
         <w:numPr>
           <w:ilvl w:val="0"/>
           <w:numId w:val="14"/>
@@ -3225,7 +3225,7 @@
     </w:p>
     <w:p>
       <w:pPr>
-        <w:pStyle w:val="ListParagraph"/>
+        <w:pStyle w:val="Lijstalinea"/>
         <w:numPr>
           <w:ilvl w:val="0"/>
           <w:numId w:val="14"/>
@@ -3303,7 +3303,7 @@
     </w:p>
     <w:p>
       <w:pPr>
-        <w:pStyle w:val="ListParagraph"/>
+        <w:pStyle w:val="Lijstalinea"/>
         <w:numPr>
           <w:ilvl w:val="0"/>
           <w:numId w:val="14"/>
@@ -3377,7 +3377,7 @@
     </w:p>
     <w:p>
       <w:pPr>
-        <w:pStyle w:val="ListParagraph"/>
+        <w:pStyle w:val="Lijstalinea"/>
         <w:numPr>
           <w:ilvl w:val="0"/>
           <w:numId w:val="14"/>
@@ -3447,7 +3447,7 @@
     </w:p>
     <w:p>
       <w:pPr>
-        <w:pStyle w:val="ListParagraph"/>
+        <w:pStyle w:val="Lijstalinea"/>
         <w:numPr>
           <w:ilvl w:val="0"/>
           <w:numId w:val="14"/>
@@ -3457,41 +3457,41 @@
         <w:rPr>
           <w:b/>
           <w:bCs/>
-          <w:lang w:val="de-DE"/>
+          <w:lang w:val="da-DK"/>
         </w:rPr>
         <w:t>UI Style</w:t>
       </w:r>
       <w:r>
         <w:rPr>
-          <w:lang w:val="de-DE"/>
-        </w:rPr>
-        <w:t xml:space="preserve">: Flat, </w:t>
+          <w:lang w:val="da-DK"/>
+        </w:rPr>
+        <w:t xml:space="preserve">: </w:t>
       </w:r>
       <w:proofErr w:type="spellStart"/>
       <w:r>
         <w:rPr>
-          <w:lang w:val="de-DE"/>
-        </w:rPr>
-        <w:t>pixel</w:t>
+          <w:lang w:val="da-DK"/>
+        </w:rPr>
+        <w:t>Flat</w:t>
       </w:r>
       <w:proofErr w:type="spellEnd"/>
       <w:r>
         <w:rPr>
-          <w:lang w:val="de-DE"/>
-        </w:rPr>
-        <w:t xml:space="preserve"> art-</w:t>
+          <w:lang w:val="da-DK"/>
+        </w:rPr>
+        <w:t>, pixel art-</w:t>
       </w:r>
       <w:proofErr w:type="spellStart"/>
       <w:r>
         <w:rPr>
-          <w:lang w:val="de-DE"/>
+          <w:lang w:val="da-DK"/>
         </w:rPr>
         <w:t>geïnspireerd</w:t>
       </w:r>
       <w:proofErr w:type="spellEnd"/>
       <w:r>
         <w:rPr>
-          <w:lang w:val="de-DE"/>
+          <w:lang w:val="da-DK"/>
         </w:rPr>
         <w:t xml:space="preserve">. </w:t>
       </w:r>
@@ -3523,7 +3523,7 @@
     <w:p/>
     <w:p>
       <w:pPr>
-        <w:pStyle w:val="Heading2"/>
+        <w:pStyle w:val="Kop2"/>
         <w:rPr>
           <w:lang w:val="nl-NL"/>
         </w:rPr>
@@ -3539,7 +3539,7 @@
     </w:p>
     <w:p>
       <w:pPr>
-        <w:pStyle w:val="Heading3"/>
+        <w:pStyle w:val="Kop3"/>
         <w:rPr>
           <w:lang w:val="nl-NL"/>
         </w:rPr>
@@ -3555,7 +3555,7 @@
     </w:p>
     <w:p>
       <w:pPr>
-        <w:pStyle w:val="ListParagraph"/>
+        <w:pStyle w:val="Lijstalinea"/>
         <w:numPr>
           <w:ilvl w:val="0"/>
           <w:numId w:val="15"/>
@@ -3573,7 +3573,7 @@
     </w:p>
     <w:p>
       <w:pPr>
-        <w:pStyle w:val="ListParagraph"/>
+        <w:pStyle w:val="Lijstalinea"/>
         <w:numPr>
           <w:ilvl w:val="0"/>
           <w:numId w:val="15"/>
@@ -3591,7 +3591,7 @@
     </w:p>
     <w:p>
       <w:pPr>
-        <w:pStyle w:val="Heading4"/>
+        <w:pStyle w:val="Kop4"/>
       </w:pPr>
       <w:proofErr w:type="spellStart"/>
       <w:r>
@@ -3601,7 +3601,7 @@
     </w:p>
     <w:p>
       <w:pPr>
-        <w:pStyle w:val="ListParagraph"/>
+        <w:pStyle w:val="Lijstalinea"/>
         <w:numPr>
           <w:ilvl w:val="0"/>
           <w:numId w:val="17"/>
@@ -3616,7 +3616,7 @@
     </w:p>
     <w:p>
       <w:pPr>
-        <w:pStyle w:val="Heading4"/>
+        <w:pStyle w:val="Kop4"/>
       </w:pPr>
       <w:proofErr w:type="spellStart"/>
       <w:r>
@@ -3626,7 +3626,7 @@
     </w:p>
     <w:p>
       <w:pPr>
-        <w:pStyle w:val="ListParagraph"/>
+        <w:pStyle w:val="Lijstalinea"/>
         <w:numPr>
           <w:ilvl w:val="0"/>
           <w:numId w:val="16"/>
@@ -3666,7 +3666,7 @@
     </w:p>
     <w:p>
       <w:pPr>
-        <w:pStyle w:val="ListParagraph"/>
+        <w:pStyle w:val="Lijstalinea"/>
         <w:numPr>
           <w:ilvl w:val="0"/>
           <w:numId w:val="16"/>
@@ -3709,7 +3709,7 @@
     </w:p>
     <w:p>
       <w:pPr>
-        <w:pStyle w:val="Heading4"/>
+        <w:pStyle w:val="Kop4"/>
         <w:rPr>
           <w:lang w:val="nl-NL"/>
         </w:rPr>
@@ -3743,7 +3743,7 @@
     </w:p>
     <w:tbl>
       <w:tblPr>
-        <w:tblStyle w:val="TableGrid"/>
+        <w:tblStyle w:val="Tabelraster"/>
         <w:tblW w:w="9348" w:type="dxa"/>
         <w:tblLook w:val="04A0" w:firstRow="1" w:lastRow="0" w:firstColumn="1" w:lastColumn="0" w:noHBand="0" w:noVBand="1"/>
       </w:tblPr>
@@ -3922,7 +3922,7 @@
     <w:p/>
     <w:p>
       <w:pPr>
-        <w:pStyle w:val="Heading2"/>
+        <w:pStyle w:val="Kop2"/>
       </w:pPr>
       <w:bookmarkStart w:id="6" w:name="_Toc231933162"/>
       <w:r>
@@ -3932,7 +3932,7 @@
     </w:p>
     <w:p>
       <w:pPr>
-        <w:pStyle w:val="ListParagraph"/>
+        <w:pStyle w:val="Lijstalinea"/>
         <w:numPr>
           <w:ilvl w:val="0"/>
           <w:numId w:val="19"/>
@@ -3972,7 +3972,7 @@
     </w:p>
     <w:p>
       <w:pPr>
-        <w:pStyle w:val="ListParagraph"/>
+        <w:pStyle w:val="Lijstalinea"/>
         <w:numPr>
           <w:ilvl w:val="0"/>
           <w:numId w:val="19"/>
@@ -4004,7 +4004,7 @@
     </w:p>
     <w:p>
       <w:pPr>
-        <w:pStyle w:val="Heading2"/>
+        <w:pStyle w:val="Kop2"/>
       </w:pPr>
       <w:bookmarkStart w:id="7" w:name="_Toc231933163"/>
       <w:r>
@@ -4014,7 +4014,7 @@
     </w:p>
     <w:p>
       <w:pPr>
-        <w:pStyle w:val="ListParagraph"/>
+        <w:pStyle w:val="Lijstalinea"/>
         <w:numPr>
           <w:ilvl w:val="0"/>
           <w:numId w:val="18"/>
@@ -4075,7 +4075,7 @@
     </w:p>
     <w:p>
       <w:pPr>
-        <w:pStyle w:val="Heading2"/>
+        <w:pStyle w:val="Kop2"/>
       </w:pPr>
       <w:proofErr w:type="spellStart"/>
       <w:r>
@@ -4101,76 +4101,48 @@
     <w:p>
       <w:pPr>
         <w:rPr>
-          <w:lang w:val="de-DE"/>
-        </w:rPr>
-      </w:pPr>
-      <w:r>
-        <w:rPr>
-          <w:lang w:val="de-DE"/>
+          <w:lang w:val="nl-NL"/>
+        </w:rPr>
+      </w:pPr>
+      <w:r>
+        <w:rPr>
+          <w:lang w:val="nl-NL"/>
         </w:rPr>
         <w:t>Bomen (</w:t>
       </w:r>
+      <w:proofErr w:type="gramStart"/>
+      <w:r>
+        <w:rPr>
+          <w:lang w:val="nl-NL"/>
+        </w:rPr>
+        <w:t>palm boom</w:t>
+      </w:r>
+      <w:proofErr w:type="gramEnd"/>
+      <w:r>
+        <w:rPr>
+          <w:lang w:val="nl-NL"/>
+        </w:rPr>
+        <w:t xml:space="preserve">, </w:t>
+      </w:r>
+      <w:r>
+        <w:rPr>
+          <w:lang w:val="nl-NL"/>
+        </w:rPr>
+        <w:t xml:space="preserve">berk, </w:t>
+      </w:r>
       <w:proofErr w:type="spellStart"/>
       <w:r>
         <w:rPr>
-          <w:lang w:val="de-DE"/>
-        </w:rPr>
-        <w:t>palm</w:t>
+          <w:lang w:val="nl-NL"/>
+        </w:rPr>
+        <w:t>denneboom</w:t>
       </w:r>
       <w:proofErr w:type="spellEnd"/>
       <w:r>
         <w:rPr>
-          <w:lang w:val="de-DE"/>
-        </w:rPr>
-        <w:t xml:space="preserve"> boom, </w:t>
-      </w:r>
-      <w:proofErr w:type="spellStart"/>
-      <w:r>
-        <w:rPr>
-          <w:lang w:val="de-DE"/>
-        </w:rPr>
-        <w:t>berk</w:t>
-      </w:r>
-      <w:proofErr w:type="spellEnd"/>
-      <w:r>
-        <w:rPr>
-          <w:lang w:val="de-DE"/>
-        </w:rPr>
-        <w:t xml:space="preserve">, </w:t>
-      </w:r>
-      <w:proofErr w:type="spellStart"/>
-      <w:r>
-        <w:rPr>
-          <w:lang w:val="de-DE"/>
-        </w:rPr>
-        <w:t>denn</w:t>
-      </w:r>
-      <w:r>
-        <w:rPr>
-          <w:lang w:val="de-DE"/>
-        </w:rPr>
-        <w:t>eboom</w:t>
-      </w:r>
-      <w:proofErr w:type="spellEnd"/>
-      <w:r>
-        <w:rPr>
-          <w:lang w:val="de-DE"/>
-        </w:rPr>
-        <w:t xml:space="preserve">, </w:t>
-      </w:r>
-      <w:proofErr w:type="spellStart"/>
-      <w:r>
-        <w:rPr>
-          <w:lang w:val="de-DE"/>
-        </w:rPr>
-        <w:t>appelboom</w:t>
-      </w:r>
-      <w:proofErr w:type="spellEnd"/>
-      <w:r>
-        <w:rPr>
-          <w:lang w:val="de-DE"/>
-        </w:rPr>
-        <w:t>)</w:t>
+          <w:lang w:val="nl-NL"/>
+        </w:rPr>
+        <w:t>, appelboom)</w:t>
       </w:r>
     </w:p>
     <w:p>
@@ -4409,7 +4381,7 @@
     </w:p>
     <w:p>
       <w:pPr>
-        <w:pStyle w:val="Heading2"/>
+        <w:pStyle w:val="Kop2"/>
         <w:rPr>
           <w:lang w:val="nl-NL"/>
         </w:rPr>
@@ -4425,7 +4397,7 @@
     </w:p>
     <w:tbl>
       <w:tblPr>
-        <w:tblStyle w:val="TableGrid"/>
+        <w:tblStyle w:val="Tabelraster"/>
         <w:tblW w:w="0" w:type="auto"/>
         <w:tblLook w:val="04A0" w:firstRow="1" w:lastRow="0" w:firstColumn="1" w:lastColumn="0" w:noHBand="0" w:noVBand="1"/>
       </w:tblPr>
@@ -4676,7 +4648,7 @@
     </w:p>
     <w:p>
       <w:pPr>
-        <w:pStyle w:val="Heading2"/>
+        <w:pStyle w:val="Kop2"/>
       </w:pPr>
       <w:bookmarkStart w:id="10" w:name="_Toc231933167"/>
       <w:proofErr w:type="spellStart"/>
@@ -4691,7 +4663,7 @@
     </w:p>
     <w:p>
       <w:pPr>
-        <w:pStyle w:val="Heading3"/>
+        <w:pStyle w:val="Kop3"/>
       </w:pPr>
       <w:bookmarkStart w:id="11" w:name="_Toc231933168"/>
       <w:proofErr w:type="spellStart"/>
@@ -4703,7 +4675,7 @@
     </w:p>
     <w:p>
       <w:pPr>
-        <w:pStyle w:val="ListParagraph"/>
+        <w:pStyle w:val="Lijstalinea"/>
         <w:numPr>
           <w:ilvl w:val="0"/>
           <w:numId w:val="18"/>
@@ -4747,7 +4719,7 @@
     </w:p>
     <w:p>
       <w:pPr>
-        <w:pStyle w:val="ListParagraph"/>
+        <w:pStyle w:val="Lijstalinea"/>
         <w:numPr>
           <w:ilvl w:val="0"/>
           <w:numId w:val="18"/>
@@ -4765,7 +4737,7 @@
     </w:p>
     <w:p>
       <w:pPr>
-        <w:pStyle w:val="Heading3"/>
+        <w:pStyle w:val="Kop3"/>
       </w:pPr>
       <w:bookmarkStart w:id="12" w:name="_Toc231933169"/>
       <w:r>
@@ -4775,7 +4747,7 @@
     </w:p>
     <w:p>
       <w:pPr>
-        <w:pStyle w:val="ListParagraph"/>
+        <w:pStyle w:val="Lijstalinea"/>
         <w:numPr>
           <w:ilvl w:val="0"/>
           <w:numId w:val="18"/>
@@ -4787,7 +4759,7 @@
     </w:p>
     <w:p>
       <w:pPr>
-        <w:pStyle w:val="ListParagraph"/>
+        <w:pStyle w:val="Lijstalinea"/>
         <w:numPr>
           <w:ilvl w:val="0"/>
           <w:numId w:val="18"/>
@@ -4820,7 +4792,7 @@
     </w:p>
     <w:p>
       <w:pPr>
-        <w:pStyle w:val="Heading3"/>
+        <w:pStyle w:val="Kop3"/>
       </w:pPr>
       <w:bookmarkStart w:id="13" w:name="_Toc231933170"/>
       <w:r>
@@ -4830,7 +4802,7 @@
     </w:p>
     <w:p>
       <w:pPr>
-        <w:pStyle w:val="ListParagraph"/>
+        <w:pStyle w:val="Lijstalinea"/>
         <w:numPr>
           <w:ilvl w:val="0"/>
           <w:numId w:val="18"/>
@@ -4890,7 +4862,7 @@
     </w:p>
     <w:p>
       <w:pPr>
-        <w:pStyle w:val="ListParagraph"/>
+        <w:pStyle w:val="Lijstalinea"/>
         <w:numPr>
           <w:ilvl w:val="0"/>
           <w:numId w:val="18"/>
@@ -4909,27 +4881,27 @@
     <w:p>
       <w:pPr>
         <w:rPr>
-          <w:rStyle w:val="Heading2Char"/>
+          <w:rStyle w:val="Kop2Char"/>
         </w:rPr>
       </w:pPr>
       <w:bookmarkStart w:id="14" w:name="_Toc231933171"/>
       <w:r>
         <w:rPr>
-          <w:rStyle w:val="Heading2Char"/>
+          <w:rStyle w:val="Kop2Char"/>
         </w:rPr>
         <w:t>Audio Style (</w:t>
       </w:r>
       <w:proofErr w:type="spellStart"/>
       <w:r>
         <w:rPr>
-          <w:rStyle w:val="Heading2Char"/>
+          <w:rStyle w:val="Kop2Char"/>
         </w:rPr>
         <w:t>optioneel</w:t>
       </w:r>
       <w:proofErr w:type="spellEnd"/>
       <w:r>
         <w:rPr>
-          <w:rStyle w:val="Heading2Char"/>
+          <w:rStyle w:val="Kop2Char"/>
         </w:rPr>
         <w:t>)</w:t>
       </w:r>
@@ -4937,7 +4909,7 @@
     </w:p>
     <w:p>
       <w:pPr>
-        <w:pStyle w:val="ListParagraph"/>
+        <w:pStyle w:val="Lijstalinea"/>
         <w:numPr>
           <w:ilvl w:val="0"/>
           <w:numId w:val="18"/>
@@ -4955,7 +4927,7 @@
     </w:p>
     <w:p>
       <w:pPr>
-        <w:pStyle w:val="ListParagraph"/>
+        <w:pStyle w:val="Lijstalinea"/>
         <w:numPr>
           <w:ilvl w:val="0"/>
           <w:numId w:val="18"/>
@@ -4996,7 +4968,7 @@
     </w:p>
     <w:p>
       <w:pPr>
-        <w:pStyle w:val="ListParagraph"/>
+        <w:pStyle w:val="Lijstalinea"/>
         <w:numPr>
           <w:ilvl w:val="0"/>
           <w:numId w:val="18"/>
@@ -5034,7 +5006,7 @@
     </w:p>
     <w:p>
       <w:pPr>
-        <w:pStyle w:val="Heading2"/>
+        <w:pStyle w:val="Kop2"/>
       </w:pPr>
       <w:bookmarkStart w:id="15" w:name="_Toc231933172"/>
       <w:r>
@@ -5169,7 +5141,7 @@
     </w:p>
     <w:p>
       <w:pPr>
-        <w:pStyle w:val="Heading2"/>
+        <w:pStyle w:val="Kop2"/>
         <w:rPr>
           <w:lang w:val="nl-NL"/>
         </w:rPr>
@@ -5310,38 +5282,30 @@
     </w:p>
     <w:p>
       <w:pPr>
-        <w:pStyle w:val="Heading2"/>
-        <w:rPr>
-          <w:lang w:val="nl-NL"/>
+        <w:pStyle w:val="Kop2"/>
+        <w:rPr>
+          <w:lang w:val="sv-SE"/>
         </w:rPr>
       </w:pPr>
       <w:bookmarkStart w:id="17" w:name="_Toc231933174"/>
-      <w:proofErr w:type="spellStart"/>
-      <w:r>
-        <w:rPr>
-          <w:lang w:val="nl-NL"/>
+      <w:r>
+        <w:rPr>
+          <w:lang w:val="sv-SE"/>
         </w:rPr>
         <w:lastRenderedPageBreak/>
-        <w:t>Miska</w:t>
-      </w:r>
-      <w:proofErr w:type="spellEnd"/>
-      <w:r>
-        <w:rPr>
-          <w:lang w:val="nl-NL"/>
-        </w:rPr>
-        <w:t xml:space="preserve"> van den Brink</w:t>
+        <w:t>Miska van den Brink</w:t>
       </w:r>
       <w:bookmarkEnd w:id="17"/>
     </w:p>
     <w:p>
       <w:pPr>
         <w:rPr>
-          <w:lang w:val="nl-NL"/>
-        </w:rPr>
-      </w:pPr>
-      <w:r>
-        <w:rPr>
-          <w:lang w:val="nl-NL"/>
+          <w:lang w:val="sv-SE"/>
+        </w:rPr>
+      </w:pPr>
+      <w:r>
+        <w:rPr>
+          <w:lang w:val="sv-SE"/>
         </w:rPr>
         <w:t>Asset:</w:t>
       </w:r>
@@ -5349,7 +5313,7 @@
     <w:p>
       <w:pPr>
         <w:rPr>
-          <w:lang w:val="nl-NL"/>
+          <w:lang w:val="sv-SE"/>
         </w:rPr>
       </w:pPr>
     </w:p>
@@ -5459,7 +5423,7 @@
     </w:p>
     <w:p>
       <w:pPr>
-        <w:pStyle w:val="Heading2"/>
+        <w:pStyle w:val="Kop2"/>
       </w:pPr>
       <w:bookmarkStart w:id="18" w:name="_Toc231933175"/>
       <w:r>
@@ -5594,18 +5558,40 @@
     </w:p>
     <w:p>
       <w:pPr>
-        <w:pStyle w:val="Heading2"/>
+        <w:pStyle w:val="Kop2"/>
       </w:pPr>
       <w:bookmarkStart w:id="19" w:name="_Toc231933176"/>
       <w:r>
         <w:lastRenderedPageBreak/>
-        <w:t xml:space="preserve">Myrthe </w:t>
+        <w:t>Myrthe Dissevelt</w:t>
+      </w:r>
+      <w:bookmarkEnd w:id="19"/>
+    </w:p>
+    <w:p>
+      <w:pPr>
+        <w:rPr>
+          <w:lang w:val="nl-NL"/>
+        </w:rPr>
+      </w:pPr>
+      <w:r>
+        <w:rPr>
+          <w:lang w:val="nl-NL"/>
+        </w:rPr>
+        <w:t>Asset:</w:t>
+      </w:r>
+      <w:r>
+        <w:rPr>
+          <w:lang w:val="nl-NL"/>
+        </w:rPr>
+        <w:t xml:space="preserve"> </w:t>
       </w:r>
       <w:proofErr w:type="spellStart"/>
       <w:r>
-        <w:t>Dissevelt</w:t>
-      </w:r>
-      <w:bookmarkEnd w:id="19"/>
+        <w:rPr>
+          <w:lang w:val="nl-NL"/>
+        </w:rPr>
+        <w:t>Boxes</w:t>
+      </w:r>
       <w:proofErr w:type="spellEnd"/>
     </w:p>
     <w:p>
@@ -5614,93 +5600,53 @@
           <w:lang w:val="nl-NL"/>
         </w:rPr>
       </w:pPr>
-      <w:r>
-        <w:rPr>
-          <w:lang w:val="nl-NL"/>
-        </w:rPr>
-        <w:t>Asset:</w:t>
-      </w:r>
-    </w:p>
-    <w:p>
-      <w:pPr>
-        <w:rPr>
-          <w:lang w:val="nl-NL"/>
-        </w:rPr>
-      </w:pPr>
-    </w:p>
-    <w:p>
-      <w:pPr>
-        <w:rPr>
-          <w:lang w:val="nl-NL"/>
-        </w:rPr>
-      </w:pPr>
-      <w:r>
-        <w:rPr>
-          <w:lang w:val="nl-NL"/>
-        </w:rPr>
-        <w:t>Moodboard + toelichting:</w:t>
-      </w:r>
-    </w:p>
-    <w:p>
-      <w:pPr>
-        <w:rPr>
-          <w:lang w:val="nl-NL"/>
-        </w:rPr>
-      </w:pPr>
-    </w:p>
-    <w:p>
-      <w:pPr>
-        <w:rPr>
-          <w:lang w:val="nl-NL"/>
-        </w:rPr>
-      </w:pPr>
-      <w:r>
-        <w:rPr>
-          <w:lang w:val="nl-NL"/>
-        </w:rPr>
-        <w:t>Kleurenpalet (</w:t>
-      </w:r>
-      <w:proofErr w:type="spellStart"/>
-      <w:r>
-        <w:rPr>
-          <w:lang w:val="nl-NL"/>
-        </w:rPr>
-        <w:t>hex</w:t>
-      </w:r>
-      <w:proofErr w:type="spellEnd"/>
-      <w:r>
-        <w:rPr>
-          <w:lang w:val="nl-NL"/>
-        </w:rPr>
-        <w:t xml:space="preserve"> nummers):</w:t>
-      </w:r>
-    </w:p>
-    <w:p>
-      <w:pPr>
-        <w:rPr>
-          <w:lang w:val="nl-NL"/>
-        </w:rPr>
-      </w:pPr>
-    </w:p>
-    <w:p>
-      <w:pPr>
-        <w:rPr>
-          <w:lang w:val="nl-NL"/>
-        </w:rPr>
-      </w:pPr>
-      <w:r>
-        <w:rPr>
-          <w:lang w:val="nl-NL"/>
-        </w:rPr>
-        <w:t>Realisatie (schermafbeeldingen en toelichting):</w:t>
-      </w:r>
-    </w:p>
-    <w:p>
-      <w:pPr>
-        <w:rPr>
-          <w:lang w:val="nl-NL"/>
-        </w:rPr>
-      </w:pPr>
+    </w:p>
+    <w:p>
+      <w:pPr>
+        <w:rPr>
+          <w:lang w:val="nl-NL"/>
+        </w:rPr>
+      </w:pPr>
+      <w:r>
+        <w:rPr>
+          <w:lang w:val="nl-NL"/>
+        </w:rPr>
+        <w:drawing>
+          <wp:inline distT="0" distB="0" distL="0" distR="0" wp14:anchorId="1E9F7077" wp14:editId="1460B303">
+            <wp:extent cx="5943600" cy="3344545"/>
+            <wp:effectExtent l="0" t="0" r="0" b="8255"/>
+            <wp:docPr id="707906495" name="Afbeelding 1"/>
+            <wp:cNvGraphicFramePr>
+              <a:graphicFrameLocks xmlns:a="http://schemas.openxmlformats.org/drawingml/2006/main" noChangeAspect="1"/>
+            </wp:cNvGraphicFramePr>
+            <a:graphic xmlns:a="http://schemas.openxmlformats.org/drawingml/2006/main">
+              <a:graphicData uri="http://schemas.openxmlformats.org/drawingml/2006/picture">
+                <pic:pic xmlns:pic="http://schemas.openxmlformats.org/drawingml/2006/picture">
+                  <pic:nvPicPr>
+                    <pic:cNvPr id="707906495" name=""/>
+                    <pic:cNvPicPr/>
+                  </pic:nvPicPr>
+                  <pic:blipFill>
+                    <a:blip r:embed="rId11"/>
+                    <a:stretch>
+                      <a:fillRect/>
+                    </a:stretch>
+                  </pic:blipFill>
+                  <pic:spPr>
+                    <a:xfrm>
+                      <a:off x="0" y="0"/>
+                      <a:ext cx="5943600" cy="3344545"/>
+                    </a:xfrm>
+                    <a:prstGeom prst="rect">
+                      <a:avLst/>
+                    </a:prstGeom>
+                  </pic:spPr>
+                </pic:pic>
+              </a:graphicData>
+            </a:graphic>
+          </wp:inline>
+        </w:drawing>
+      </w:r>
     </w:p>
     <w:p>
       <w:pPr>
@@ -5734,7 +5680,7 @@
     </w:p>
     <w:p>
       <w:pPr>
-        <w:pStyle w:val="Heading2"/>
+        <w:pStyle w:val="Kop2"/>
       </w:pPr>
       <w:bookmarkStart w:id="20" w:name="_Toc231933177"/>
       <w:r>
@@ -5869,7 +5815,7 @@
     </w:p>
     <w:p>
       <w:pPr>
-        <w:pStyle w:val="Heading2"/>
+        <w:pStyle w:val="Kop2"/>
       </w:pPr>
       <w:bookmarkStart w:id="21" w:name="_Toc231933178"/>
       <w:r>
@@ -6009,7 +5955,7 @@
     </w:p>
     <w:p>
       <w:pPr>
-        <w:pStyle w:val="Heading2"/>
+        <w:pStyle w:val="Kop2"/>
       </w:pPr>
       <w:bookmarkStart w:id="22" w:name="_Toc231933179"/>
       <w:r>
@@ -6149,7 +6095,7 @@
     </w:p>
     <w:p>
       <w:pPr>
-        <w:pStyle w:val="Heading2"/>
+        <w:pStyle w:val="Kop2"/>
       </w:pPr>
       <w:bookmarkStart w:id="23" w:name="_Toc231933180"/>
       <w:r>
@@ -6284,7 +6230,7 @@
     </w:p>
     <w:p>
       <w:pPr>
-        <w:pStyle w:val="Heading2"/>
+        <w:pStyle w:val="Kop2"/>
       </w:pPr>
       <w:bookmarkStart w:id="24" w:name="_Toc231933181"/>
       <w:r>
@@ -6424,7 +6370,7 @@
     </w:p>
     <w:p>
       <w:pPr>
-        <w:pStyle w:val="Heading2"/>
+        <w:pStyle w:val="Kop2"/>
       </w:pPr>
       <w:bookmarkStart w:id="25" w:name="_Toc231933182"/>
       <w:r>
@@ -6559,7 +6505,7 @@
     </w:p>
     <w:p>
       <w:pPr>
-        <w:pStyle w:val="Heading2"/>
+        <w:pStyle w:val="Kop2"/>
       </w:pPr>
       <w:bookmarkStart w:id="26" w:name="_Toc231933183"/>
       <w:r>
@@ -6697,7 +6643,7 @@
     </w:p>
     <w:p>
       <w:pPr>
-        <w:pStyle w:val="Heading2"/>
+        <w:pStyle w:val="Kop2"/>
       </w:pPr>
       <w:bookmarkStart w:id="27" w:name="_Toc231933184"/>
       <w:r>
@@ -6832,7 +6778,7 @@
     </w:p>
     <w:p>
       <w:pPr>
-        <w:pStyle w:val="Heading2"/>
+        <w:pStyle w:val="Kop2"/>
       </w:pPr>
       <w:bookmarkStart w:id="28" w:name="_Toc231933185"/>
       <w:r>
@@ -6967,7 +6913,7 @@
     </w:p>
     <w:p>
       <w:pPr>
-        <w:pStyle w:val="Heading2"/>
+        <w:pStyle w:val="Kop2"/>
         <w:rPr>
           <w:lang w:val="nl-NL"/>
         </w:rPr>
@@ -7091,7 +7037,7 @@
     </w:p>
     <w:p/>
     <w:sectPr>
-      <w:footerReference w:type="default" r:id="rId11"/>
+      <w:footerReference w:type="default" r:id="rId12"/>
       <w:pgSz w:w="12240" w:h="15840"/>
       <w:pgMar w:top="1440" w:right="1440" w:bottom="1440" w:left="1440" w:header="720" w:footer="720" w:gutter="0"/>
       <w:pgNumType w:start="0"/>
@@ -7146,7 +7092,7 @@
     <w:sdtContent>
       <w:p>
         <w:pPr>
-          <w:pStyle w:val="Footer"/>
+          <w:pStyle w:val="Voettekst"/>
           <w:jc w:val="right"/>
         </w:pPr>
         <w:r>
@@ -7175,7 +7121,7 @@
   </w:sdt>
   <w:p>
     <w:pPr>
-      <w:pStyle w:val="Footer"/>
+      <w:pStyle w:val="Voettekst"/>
     </w:pPr>
   </w:p>
 </w:ftr>
@@ -11120,15 +11066,15 @@
     <w:lsdException w:name="Unresolved Mention" w:semiHidden="1" w:unhideWhenUsed="1"/>
     <w:lsdException w:name="Smart Link" w:semiHidden="1" w:unhideWhenUsed="1"/>
   </w:latentStyles>
-  <w:style w:type="paragraph" w:default="1" w:styleId="Normal">
+  <w:style w:type="paragraph" w:default="1" w:styleId="Standaard">
     <w:name w:val="Normal"/>
     <w:qFormat/>
   </w:style>
-  <w:style w:type="paragraph" w:styleId="Heading1">
+  <w:style w:type="paragraph" w:styleId="Kop1">
     <w:name w:val="heading 1"/>
-    <w:basedOn w:val="Normal"/>
-    <w:next w:val="Normal"/>
-    <w:link w:val="Heading1Char"/>
+    <w:basedOn w:val="Standaard"/>
+    <w:next w:val="Standaard"/>
+    <w:link w:val="Kop1Char"/>
     <w:uiPriority w:val="9"/>
     <w:qFormat/>
     <w:rsid w:val="00DB7FDB"/>
@@ -11145,11 +11091,11 @@
       <w:szCs w:val="40"/>
     </w:rPr>
   </w:style>
-  <w:style w:type="paragraph" w:styleId="Heading2">
+  <w:style w:type="paragraph" w:styleId="Kop2">
     <w:name w:val="heading 2"/>
-    <w:basedOn w:val="Normal"/>
-    <w:next w:val="Normal"/>
-    <w:link w:val="Heading2Char"/>
+    <w:basedOn w:val="Standaard"/>
+    <w:next w:val="Standaard"/>
+    <w:link w:val="Kop2Char"/>
     <w:uiPriority w:val="9"/>
     <w:unhideWhenUsed/>
     <w:qFormat/>
@@ -11167,11 +11113,11 @@
       <w:szCs w:val="32"/>
     </w:rPr>
   </w:style>
-  <w:style w:type="paragraph" w:styleId="Heading3">
+  <w:style w:type="paragraph" w:styleId="Kop3">
     <w:name w:val="heading 3"/>
-    <w:basedOn w:val="Normal"/>
-    <w:next w:val="Normal"/>
-    <w:link w:val="Heading3Char"/>
+    <w:basedOn w:val="Standaard"/>
+    <w:next w:val="Standaard"/>
+    <w:link w:val="Kop3Char"/>
     <w:uiPriority w:val="9"/>
     <w:unhideWhenUsed/>
     <w:qFormat/>
@@ -11189,11 +11135,11 @@
       <w:szCs w:val="28"/>
     </w:rPr>
   </w:style>
-  <w:style w:type="paragraph" w:styleId="Heading4">
+  <w:style w:type="paragraph" w:styleId="Kop4">
     <w:name w:val="heading 4"/>
-    <w:basedOn w:val="Normal"/>
-    <w:next w:val="Normal"/>
-    <w:link w:val="Heading4Char"/>
+    <w:basedOn w:val="Standaard"/>
+    <w:next w:val="Standaard"/>
+    <w:link w:val="Kop4Char"/>
     <w:uiPriority w:val="9"/>
     <w:unhideWhenUsed/>
     <w:qFormat/>
@@ -11211,11 +11157,11 @@
       <w:color w:val="0F4761" w:themeColor="accent1" w:themeShade="BF"/>
     </w:rPr>
   </w:style>
-  <w:style w:type="paragraph" w:styleId="Heading5">
+  <w:style w:type="paragraph" w:styleId="Kop5">
     <w:name w:val="heading 5"/>
-    <w:basedOn w:val="Normal"/>
-    <w:next w:val="Normal"/>
-    <w:link w:val="Heading5Char"/>
+    <w:basedOn w:val="Standaard"/>
+    <w:next w:val="Standaard"/>
+    <w:link w:val="Kop5Char"/>
     <w:uiPriority w:val="9"/>
     <w:semiHidden/>
     <w:unhideWhenUsed/>
@@ -11232,11 +11178,11 @@
       <w:color w:val="0F4761" w:themeColor="accent1" w:themeShade="BF"/>
     </w:rPr>
   </w:style>
-  <w:style w:type="paragraph" w:styleId="Heading6">
+  <w:style w:type="paragraph" w:styleId="Kop6">
     <w:name w:val="heading 6"/>
-    <w:basedOn w:val="Normal"/>
-    <w:next w:val="Normal"/>
-    <w:link w:val="Heading6Char"/>
+    <w:basedOn w:val="Standaard"/>
+    <w:next w:val="Standaard"/>
+    <w:link w:val="Kop6Char"/>
     <w:uiPriority w:val="9"/>
     <w:semiHidden/>
     <w:unhideWhenUsed/>
@@ -11255,11 +11201,11 @@
       <w:color w:val="595959" w:themeColor="text1" w:themeTint="A6"/>
     </w:rPr>
   </w:style>
-  <w:style w:type="paragraph" w:styleId="Heading7">
+  <w:style w:type="paragraph" w:styleId="Kop7">
     <w:name w:val="heading 7"/>
-    <w:basedOn w:val="Normal"/>
-    <w:next w:val="Normal"/>
-    <w:link w:val="Heading7Char"/>
+    <w:basedOn w:val="Standaard"/>
+    <w:next w:val="Standaard"/>
+    <w:link w:val="Kop7Char"/>
     <w:uiPriority w:val="9"/>
     <w:semiHidden/>
     <w:unhideWhenUsed/>
@@ -11276,11 +11222,11 @@
       <w:color w:val="595959" w:themeColor="text1" w:themeTint="A6"/>
     </w:rPr>
   </w:style>
-  <w:style w:type="paragraph" w:styleId="Heading8">
+  <w:style w:type="paragraph" w:styleId="Kop8">
     <w:name w:val="heading 8"/>
-    <w:basedOn w:val="Normal"/>
-    <w:next w:val="Normal"/>
-    <w:link w:val="Heading8Char"/>
+    <w:basedOn w:val="Standaard"/>
+    <w:next w:val="Standaard"/>
+    <w:link w:val="Kop8Char"/>
     <w:uiPriority w:val="9"/>
     <w:semiHidden/>
     <w:unhideWhenUsed/>
@@ -11299,11 +11245,11 @@
       <w:color w:val="272727" w:themeColor="text1" w:themeTint="D8"/>
     </w:rPr>
   </w:style>
-  <w:style w:type="paragraph" w:styleId="Heading9">
+  <w:style w:type="paragraph" w:styleId="Kop9">
     <w:name w:val="heading 9"/>
-    <w:basedOn w:val="Normal"/>
-    <w:next w:val="Normal"/>
-    <w:link w:val="Heading9Char"/>
+    <w:basedOn w:val="Standaard"/>
+    <w:next w:val="Standaard"/>
+    <w:link w:val="Kop9Char"/>
     <w:uiPriority w:val="9"/>
     <w:semiHidden/>
     <w:unhideWhenUsed/>
@@ -11320,12 +11266,13 @@
       <w:color w:val="272727" w:themeColor="text1" w:themeTint="D8"/>
     </w:rPr>
   </w:style>
-  <w:style w:type="character" w:default="1" w:styleId="DefaultParagraphFont">
+  <w:style w:type="character" w:default="1" w:styleId="Standaardalinea-lettertype">
     <w:name w:val="Default Paragraph Font"/>
     <w:uiPriority w:val="1"/>
+    <w:semiHidden/>
     <w:unhideWhenUsed/>
   </w:style>
-  <w:style w:type="table" w:default="1" w:styleId="TableNormal">
+  <w:style w:type="table" w:default="1" w:styleId="Standaardtabel">
     <w:name w:val="Normal Table"/>
     <w:uiPriority w:val="99"/>
     <w:semiHidden/>
@@ -11340,16 +11287,16 @@
       </w:tblCellMar>
     </w:tblPr>
   </w:style>
-  <w:style w:type="numbering" w:default="1" w:styleId="NoList">
+  <w:style w:type="numbering" w:default="1" w:styleId="Geenlijst">
     <w:name w:val="No List"/>
     <w:uiPriority w:val="99"/>
     <w:semiHidden/>
     <w:unhideWhenUsed/>
   </w:style>
-  <w:style w:type="character" w:customStyle="1" w:styleId="Heading1Char">
-    <w:name w:val="Heading 1 Char"/>
-    <w:basedOn w:val="DefaultParagraphFont"/>
-    <w:link w:val="Heading1"/>
+  <w:style w:type="character" w:customStyle="1" w:styleId="Kop1Char">
+    <w:name w:val="Kop 1 Char"/>
+    <w:basedOn w:val="Standaardalinea-lettertype"/>
+    <w:link w:val="Kop1"/>
     <w:uiPriority w:val="9"/>
     <w:rsid w:val="00DB7FDB"/>
     <w:rPr>
@@ -11359,10 +11306,10 @@
       <w:szCs w:val="40"/>
     </w:rPr>
   </w:style>
-  <w:style w:type="character" w:customStyle="1" w:styleId="Heading2Char">
-    <w:name w:val="Heading 2 Char"/>
-    <w:basedOn w:val="DefaultParagraphFont"/>
-    <w:link w:val="Heading2"/>
+  <w:style w:type="character" w:customStyle="1" w:styleId="Kop2Char">
+    <w:name w:val="Kop 2 Char"/>
+    <w:basedOn w:val="Standaardalinea-lettertype"/>
+    <w:link w:val="Kop2"/>
     <w:uiPriority w:val="9"/>
     <w:rsid w:val="00DB7FDB"/>
     <w:rPr>
@@ -11372,10 +11319,10 @@
       <w:szCs w:val="32"/>
     </w:rPr>
   </w:style>
-  <w:style w:type="character" w:customStyle="1" w:styleId="Heading3Char">
-    <w:name w:val="Heading 3 Char"/>
-    <w:basedOn w:val="DefaultParagraphFont"/>
-    <w:link w:val="Heading3"/>
+  <w:style w:type="character" w:customStyle="1" w:styleId="Kop3Char">
+    <w:name w:val="Kop 3 Char"/>
+    <w:basedOn w:val="Standaardalinea-lettertype"/>
+    <w:link w:val="Kop3"/>
     <w:uiPriority w:val="9"/>
     <w:rsid w:val="00DB7FDB"/>
     <w:rPr>
@@ -11385,10 +11332,10 @@
       <w:szCs w:val="28"/>
     </w:rPr>
   </w:style>
-  <w:style w:type="character" w:customStyle="1" w:styleId="Heading4Char">
-    <w:name w:val="Heading 4 Char"/>
-    <w:basedOn w:val="DefaultParagraphFont"/>
-    <w:link w:val="Heading4"/>
+  <w:style w:type="character" w:customStyle="1" w:styleId="Kop4Char">
+    <w:name w:val="Kop 4 Char"/>
+    <w:basedOn w:val="Standaardalinea-lettertype"/>
+    <w:link w:val="Kop4"/>
     <w:uiPriority w:val="9"/>
     <w:rsid w:val="00DB7FDB"/>
     <w:rPr>
@@ -11398,10 +11345,10 @@
       <w:color w:val="0F4761" w:themeColor="accent1" w:themeShade="BF"/>
     </w:rPr>
   </w:style>
-  <w:style w:type="character" w:customStyle="1" w:styleId="Heading5Char">
-    <w:name w:val="Heading 5 Char"/>
-    <w:basedOn w:val="DefaultParagraphFont"/>
-    <w:link w:val="Heading5"/>
+  <w:style w:type="character" w:customStyle="1" w:styleId="Kop5Char">
+    <w:name w:val="Kop 5 Char"/>
+    <w:basedOn w:val="Standaardalinea-lettertype"/>
+    <w:link w:val="Kop5"/>
     <w:uiPriority w:val="9"/>
     <w:semiHidden/>
     <w:rsid w:val="00DB7FDB"/>
@@ -11410,10 +11357,10 @@
       <w:color w:val="0F4761" w:themeColor="accent1" w:themeShade="BF"/>
     </w:rPr>
   </w:style>
-  <w:style w:type="character" w:customStyle="1" w:styleId="Heading6Char">
-    <w:name w:val="Heading 6 Char"/>
-    <w:basedOn w:val="DefaultParagraphFont"/>
-    <w:link w:val="Heading6"/>
+  <w:style w:type="character" w:customStyle="1" w:styleId="Kop6Char">
+    <w:name w:val="Kop 6 Char"/>
+    <w:basedOn w:val="Standaardalinea-lettertype"/>
+    <w:link w:val="Kop6"/>
     <w:uiPriority w:val="9"/>
     <w:semiHidden/>
     <w:rsid w:val="00DB7FDB"/>
@@ -11424,10 +11371,10 @@
       <w:color w:val="595959" w:themeColor="text1" w:themeTint="A6"/>
     </w:rPr>
   </w:style>
-  <w:style w:type="character" w:customStyle="1" w:styleId="Heading7Char">
-    <w:name w:val="Heading 7 Char"/>
-    <w:basedOn w:val="DefaultParagraphFont"/>
-    <w:link w:val="Heading7"/>
+  <w:style w:type="character" w:customStyle="1" w:styleId="Kop7Char">
+    <w:name w:val="Kop 7 Char"/>
+    <w:basedOn w:val="Standaardalinea-lettertype"/>
+    <w:link w:val="Kop7"/>
     <w:uiPriority w:val="9"/>
     <w:semiHidden/>
     <w:rsid w:val="00DB7FDB"/>
@@ -11436,10 +11383,10 @@
       <w:color w:val="595959" w:themeColor="text1" w:themeTint="A6"/>
     </w:rPr>
   </w:style>
-  <w:style w:type="character" w:customStyle="1" w:styleId="Heading8Char">
-    <w:name w:val="Heading 8 Char"/>
-    <w:basedOn w:val="DefaultParagraphFont"/>
-    <w:link w:val="Heading8"/>
+  <w:style w:type="character" w:customStyle="1" w:styleId="Kop8Char">
+    <w:name w:val="Kop 8 Char"/>
+    <w:basedOn w:val="Standaardalinea-lettertype"/>
+    <w:link w:val="Kop8"/>
     <w:uiPriority w:val="9"/>
     <w:semiHidden/>
     <w:rsid w:val="00DB7FDB"/>
@@ -11450,10 +11397,10 @@
       <w:color w:val="272727" w:themeColor="text1" w:themeTint="D8"/>
     </w:rPr>
   </w:style>
-  <w:style w:type="character" w:customStyle="1" w:styleId="Heading9Char">
-    <w:name w:val="Heading 9 Char"/>
-    <w:basedOn w:val="DefaultParagraphFont"/>
-    <w:link w:val="Heading9"/>
+  <w:style w:type="character" w:customStyle="1" w:styleId="Kop9Char">
+    <w:name w:val="Kop 9 Char"/>
+    <w:basedOn w:val="Standaardalinea-lettertype"/>
+    <w:link w:val="Kop9"/>
     <w:uiPriority w:val="9"/>
     <w:semiHidden/>
     <w:rsid w:val="00DB7FDB"/>
@@ -11462,11 +11409,11 @@
       <w:color w:val="272727" w:themeColor="text1" w:themeTint="D8"/>
     </w:rPr>
   </w:style>
-  <w:style w:type="paragraph" w:styleId="Title">
+  <w:style w:type="paragraph" w:styleId="Titel">
     <w:name w:val="Title"/>
-    <w:basedOn w:val="Normal"/>
-    <w:next w:val="Normal"/>
-    <w:link w:val="TitleChar"/>
+    <w:basedOn w:val="Standaard"/>
+    <w:next w:val="Standaard"/>
+    <w:link w:val="TitelChar"/>
     <w:uiPriority w:val="10"/>
     <w:qFormat/>
     <w:rsid w:val="00DB7FDB"/>
@@ -11482,10 +11429,10 @@
       <w:szCs w:val="56"/>
     </w:rPr>
   </w:style>
-  <w:style w:type="character" w:customStyle="1" w:styleId="TitleChar">
-    <w:name w:val="Title Char"/>
-    <w:basedOn w:val="DefaultParagraphFont"/>
-    <w:link w:val="Title"/>
+  <w:style w:type="character" w:customStyle="1" w:styleId="TitelChar">
+    <w:name w:val="Titel Char"/>
+    <w:basedOn w:val="Standaardalinea-lettertype"/>
+    <w:link w:val="Titel"/>
     <w:uiPriority w:val="10"/>
     <w:rsid w:val="00DB7FDB"/>
     <w:rPr>
@@ -11496,11 +11443,11 @@
       <w:szCs w:val="56"/>
     </w:rPr>
   </w:style>
-  <w:style w:type="paragraph" w:styleId="Subtitle">
+  <w:style w:type="paragraph" w:styleId="Ondertitel">
     <w:name w:val="Subtitle"/>
-    <w:basedOn w:val="Normal"/>
-    <w:next w:val="Normal"/>
-    <w:link w:val="SubtitleChar"/>
+    <w:basedOn w:val="Standaard"/>
+    <w:next w:val="Standaard"/>
+    <w:link w:val="OndertitelChar"/>
     <w:uiPriority w:val="11"/>
     <w:qFormat/>
     <w:rsid w:val="00DB7FDB"/>
@@ -11517,10 +11464,10 @@
       <w:szCs w:val="28"/>
     </w:rPr>
   </w:style>
-  <w:style w:type="character" w:customStyle="1" w:styleId="SubtitleChar">
-    <w:name w:val="Subtitle Char"/>
-    <w:basedOn w:val="DefaultParagraphFont"/>
-    <w:link w:val="Subtitle"/>
+  <w:style w:type="character" w:customStyle="1" w:styleId="OndertitelChar">
+    <w:name w:val="Ondertitel Char"/>
+    <w:basedOn w:val="Standaardalinea-lettertype"/>
+    <w:link w:val="Ondertitel"/>
     <w:uiPriority w:val="11"/>
     <w:rsid w:val="00DB7FDB"/>
     <w:rPr>
@@ -11531,11 +11478,11 @@
       <w:szCs w:val="28"/>
     </w:rPr>
   </w:style>
-  <w:style w:type="paragraph" w:styleId="Quote">
+  <w:style w:type="paragraph" w:styleId="Citaat">
     <w:name w:val="Quote"/>
-    <w:basedOn w:val="Normal"/>
-    <w:next w:val="Normal"/>
-    <w:link w:val="QuoteChar"/>
+    <w:basedOn w:val="Standaard"/>
+    <w:next w:val="Standaard"/>
+    <w:link w:val="CitaatChar"/>
     <w:uiPriority w:val="29"/>
     <w:qFormat/>
     <w:rsid w:val="00DB7FDB"/>
@@ -11549,10 +11496,10 @@
       <w:color w:val="404040" w:themeColor="text1" w:themeTint="BF"/>
     </w:rPr>
   </w:style>
-  <w:style w:type="character" w:customStyle="1" w:styleId="QuoteChar">
-    <w:name w:val="Quote Char"/>
-    <w:basedOn w:val="DefaultParagraphFont"/>
-    <w:link w:val="Quote"/>
+  <w:style w:type="character" w:customStyle="1" w:styleId="CitaatChar">
+    <w:name w:val="Citaat Char"/>
+    <w:basedOn w:val="Standaardalinea-lettertype"/>
+    <w:link w:val="Citaat"/>
     <w:uiPriority w:val="29"/>
     <w:rsid w:val="00DB7FDB"/>
     <w:rPr>
@@ -11561,9 +11508,9 @@
       <w:color w:val="404040" w:themeColor="text1" w:themeTint="BF"/>
     </w:rPr>
   </w:style>
-  <w:style w:type="paragraph" w:styleId="ListParagraph">
+  <w:style w:type="paragraph" w:styleId="Lijstalinea">
     <w:name w:val="List Paragraph"/>
-    <w:basedOn w:val="Normal"/>
+    <w:basedOn w:val="Standaard"/>
     <w:uiPriority w:val="34"/>
     <w:qFormat/>
     <w:rsid w:val="00DB7FDB"/>
@@ -11572,9 +11519,9 @@
       <w:contextualSpacing/>
     </w:pPr>
   </w:style>
-  <w:style w:type="character" w:styleId="IntenseEmphasis">
+  <w:style w:type="character" w:styleId="Intensievebenadrukking">
     <w:name w:val="Intense Emphasis"/>
-    <w:basedOn w:val="DefaultParagraphFont"/>
+    <w:basedOn w:val="Standaardalinea-lettertype"/>
     <w:uiPriority w:val="21"/>
     <w:qFormat/>
     <w:rsid w:val="00DB7FDB"/>
@@ -11584,11 +11531,11 @@
       <w:color w:val="0F4761" w:themeColor="accent1" w:themeShade="BF"/>
     </w:rPr>
   </w:style>
-  <w:style w:type="paragraph" w:styleId="IntenseQuote">
+  <w:style w:type="paragraph" w:styleId="Duidelijkcitaat">
     <w:name w:val="Intense Quote"/>
-    <w:basedOn w:val="Normal"/>
-    <w:next w:val="Normal"/>
-    <w:link w:val="IntenseQuoteChar"/>
+    <w:basedOn w:val="Standaard"/>
+    <w:next w:val="Standaard"/>
+    <w:link w:val="DuidelijkcitaatChar"/>
     <w:uiPriority w:val="30"/>
     <w:qFormat/>
     <w:rsid w:val="00DB7FDB"/>
@@ -11607,10 +11554,10 @@
       <w:color w:val="0F4761" w:themeColor="accent1" w:themeShade="BF"/>
     </w:rPr>
   </w:style>
-  <w:style w:type="character" w:customStyle="1" w:styleId="IntenseQuoteChar">
-    <w:name w:val="Intense Quote Char"/>
-    <w:basedOn w:val="DefaultParagraphFont"/>
-    <w:link w:val="IntenseQuote"/>
+  <w:style w:type="character" w:customStyle="1" w:styleId="DuidelijkcitaatChar">
+    <w:name w:val="Duidelijk citaat Char"/>
+    <w:basedOn w:val="Standaardalinea-lettertype"/>
+    <w:link w:val="Duidelijkcitaat"/>
     <w:uiPriority w:val="30"/>
     <w:rsid w:val="00DB7FDB"/>
     <w:rPr>
@@ -11619,9 +11566,9 @@
       <w:color w:val="0F4761" w:themeColor="accent1" w:themeShade="BF"/>
     </w:rPr>
   </w:style>
-  <w:style w:type="character" w:styleId="IntenseReference">
+  <w:style w:type="character" w:styleId="Intensieveverwijzing">
     <w:name w:val="Intense Reference"/>
-    <w:basedOn w:val="DefaultParagraphFont"/>
+    <w:basedOn w:val="Standaardalinea-lettertype"/>
     <w:uiPriority w:val="32"/>
     <w:qFormat/>
     <w:rsid w:val="00DB7FDB"/>
@@ -11633,9 +11580,9 @@
       <w:spacing w:val="5"/>
     </w:rPr>
   </w:style>
-  <w:style w:type="table" w:styleId="TableGrid">
+  <w:style w:type="table" w:styleId="Tabelraster">
     <w:name w:val="Table Grid"/>
-    <w:basedOn w:val="TableNormal"/>
+    <w:basedOn w:val="Standaardtabel"/>
     <w:uiPriority w:val="39"/>
     <w:rsid w:val="00DB7FDB"/>
     <w:pPr>
@@ -11652,10 +11599,10 @@
       </w:tblBorders>
     </w:tblPr>
   </w:style>
-  <w:style w:type="paragraph" w:styleId="Header">
+  <w:style w:type="paragraph" w:styleId="Koptekst">
     <w:name w:val="header"/>
-    <w:basedOn w:val="Normal"/>
-    <w:link w:val="HeaderChar"/>
+    <w:basedOn w:val="Standaard"/>
+    <w:link w:val="KoptekstChar"/>
     <w:uiPriority w:val="99"/>
     <w:unhideWhenUsed/>
     <w:rsid w:val="003F6087"/>
@@ -11667,17 +11614,17 @@
       <w:spacing w:after="0" w:line="240" w:lineRule="auto"/>
     </w:pPr>
   </w:style>
-  <w:style w:type="character" w:customStyle="1" w:styleId="HeaderChar">
-    <w:name w:val="Header Char"/>
-    <w:basedOn w:val="DefaultParagraphFont"/>
-    <w:link w:val="Header"/>
+  <w:style w:type="character" w:customStyle="1" w:styleId="KoptekstChar">
+    <w:name w:val="Koptekst Char"/>
+    <w:basedOn w:val="Standaardalinea-lettertype"/>
+    <w:link w:val="Koptekst"/>
     <w:uiPriority w:val="99"/>
     <w:rsid w:val="003F6087"/>
   </w:style>
-  <w:style w:type="paragraph" w:styleId="Footer">
+  <w:style w:type="paragraph" w:styleId="Voettekst">
     <w:name w:val="footer"/>
-    <w:basedOn w:val="Normal"/>
-    <w:link w:val="FooterChar"/>
+    <w:basedOn w:val="Standaard"/>
+    <w:link w:val="VoettekstChar"/>
     <w:uiPriority w:val="99"/>
     <w:unhideWhenUsed/>
     <w:rsid w:val="003F6087"/>
@@ -11689,16 +11636,16 @@
       <w:spacing w:after="0" w:line="240" w:lineRule="auto"/>
     </w:pPr>
   </w:style>
-  <w:style w:type="character" w:customStyle="1" w:styleId="FooterChar">
-    <w:name w:val="Footer Char"/>
-    <w:basedOn w:val="DefaultParagraphFont"/>
-    <w:link w:val="Footer"/>
+  <w:style w:type="character" w:customStyle="1" w:styleId="VoettekstChar">
+    <w:name w:val="Voettekst Char"/>
+    <w:basedOn w:val="Standaardalinea-lettertype"/>
+    <w:link w:val="Voettekst"/>
     <w:uiPriority w:val="99"/>
     <w:rsid w:val="003F6087"/>
   </w:style>
-  <w:style w:type="paragraph" w:styleId="NoSpacing">
+  <w:style w:type="paragraph" w:styleId="Geenafstand">
     <w:name w:val="No Spacing"/>
-    <w:link w:val="NoSpacingChar"/>
+    <w:link w:val="GeenafstandChar"/>
     <w:uiPriority w:val="1"/>
     <w:qFormat/>
     <w:rsid w:val="003F6087"/>
@@ -11713,10 +11660,10 @@
       <w14:ligatures w14:val="none"/>
     </w:rPr>
   </w:style>
-  <w:style w:type="character" w:customStyle="1" w:styleId="NoSpacingChar">
-    <w:name w:val="No Spacing Char"/>
-    <w:basedOn w:val="DefaultParagraphFont"/>
-    <w:link w:val="NoSpacing"/>
+  <w:style w:type="character" w:customStyle="1" w:styleId="GeenafstandChar">
+    <w:name w:val="Geen afstand Char"/>
+    <w:basedOn w:val="Standaardalinea-lettertype"/>
+    <w:link w:val="Geenafstand"/>
     <w:uiPriority w:val="1"/>
     <w:rsid w:val="003F6087"/>
     <w:rPr>
@@ -11727,10 +11674,10 @@
       <w14:ligatures w14:val="none"/>
     </w:rPr>
   </w:style>
-  <w:style w:type="paragraph" w:styleId="TOCHeading">
+  <w:style w:type="paragraph" w:styleId="Kopvaninhoudsopgave">
     <w:name w:val="TOC Heading"/>
-    <w:basedOn w:val="Heading1"/>
-    <w:next w:val="Normal"/>
+    <w:basedOn w:val="Kop1"/>
+    <w:next w:val="Standaard"/>
     <w:uiPriority w:val="39"/>
     <w:unhideWhenUsed/>
     <w:qFormat/>
@@ -11746,10 +11693,10 @@
       <w14:ligatures w14:val="none"/>
     </w:rPr>
   </w:style>
-  <w:style w:type="paragraph" w:styleId="TOC1">
+  <w:style w:type="paragraph" w:styleId="Inhopg1">
     <w:name w:val="toc 1"/>
-    <w:basedOn w:val="Normal"/>
-    <w:next w:val="Normal"/>
+    <w:basedOn w:val="Standaard"/>
+    <w:next w:val="Standaard"/>
     <w:autoRedefine/>
     <w:uiPriority w:val="39"/>
     <w:unhideWhenUsed/>
@@ -11758,10 +11705,10 @@
       <w:spacing w:after="100"/>
     </w:pPr>
   </w:style>
-  <w:style w:type="paragraph" w:styleId="TOC2">
+  <w:style w:type="paragraph" w:styleId="Inhopg2">
     <w:name w:val="toc 2"/>
-    <w:basedOn w:val="Normal"/>
-    <w:next w:val="Normal"/>
+    <w:basedOn w:val="Standaard"/>
+    <w:next w:val="Standaard"/>
     <w:autoRedefine/>
     <w:uiPriority w:val="39"/>
     <w:unhideWhenUsed/>
@@ -11771,10 +11718,10 @@
       <w:ind w:left="240"/>
     </w:pPr>
   </w:style>
-  <w:style w:type="paragraph" w:styleId="TOC3">
+  <w:style w:type="paragraph" w:styleId="Inhopg3">
     <w:name w:val="toc 3"/>
-    <w:basedOn w:val="Normal"/>
-    <w:next w:val="Normal"/>
+    <w:basedOn w:val="Standaard"/>
+    <w:next w:val="Standaard"/>
     <w:autoRedefine/>
     <w:uiPriority w:val="39"/>
     <w:unhideWhenUsed/>
@@ -11786,7 +11733,7 @@
   </w:style>
   <w:style w:type="character" w:styleId="Hyperlink">
     <w:name w:val="Hyperlink"/>
-    <w:basedOn w:val="DefaultParagraphFont"/>
+    <w:basedOn w:val="Standaardalinea-lettertype"/>
     <w:uiPriority w:val="99"/>
     <w:unhideWhenUsed/>
     <w:rsid w:val="003F6087"/>
@@ -12094,19 +12041,19 @@
 </file>
 
 <file path=customXml/item1.xml><?xml version="1.0" encoding="utf-8"?>
-<p:properties xmlns:p="http://schemas.microsoft.com/office/2006/metadata/properties" xmlns:xsi="http://www.w3.org/2001/XMLSchema-instance" xmlns:pc="http://schemas.microsoft.com/office/infopath/2007/PartnerControls">
-  <documentManagement>
-    <TaxCatchAll xmlns="8902adb9-d5ab-4519-807d-4f8787b35b14" xsi:nil="true"/>
-    <lcf76f155ced4ddcb4097134ff3c332f xmlns="3bb2d62f-9cf3-41e4-8e26-dc347878987c">
-      <Terms xmlns="http://schemas.microsoft.com/office/infopath/2007/PartnerControls"/>
-    </lcf76f155ced4ddcb4097134ff3c332f>
-    <opmerking xmlns="3bb2d62f-9cf3-41e4-8e26-dc347878987c" xsi:nil="true"/>
-    <Date xmlns="3bb2d62f-9cf3-41e4-8e26-dc347878987c" xsi:nil="true"/>
-  </documentManagement>
-</p:properties>
+<?mso-contentType ?>
+<FormTemplates xmlns="http://schemas.microsoft.com/sharepoint/v3/contenttype/forms">
+  <Display>DocumentLibraryForm</Display>
+  <Edit>DocumentLibraryForm</Edit>
+  <New>DocumentLibraryForm</New>
+</FormTemplates>
 </file>
 
 <file path=customXml/item2.xml><?xml version="1.0" encoding="utf-8"?>
+<b:Sources xmlns:b="http://schemas.openxmlformats.org/officeDocument/2006/bibliography" xmlns="http://schemas.openxmlformats.org/officeDocument/2006/bibliography" SelectedStyle="\APASixthEditionOfficeOnline.xsl" StyleName="APA" Version="6"/>
+</file>
+
+<file path=customXml/item3.xml><?xml version="1.0" encoding="utf-8"?>
 <ct:contentTypeSchema xmlns:ct="http://schemas.microsoft.com/office/2006/metadata/contentType" xmlns:ma="http://schemas.microsoft.com/office/2006/metadata/properties/metaAttributes" ct:_="" ma:_="" ma:contentTypeName="Document" ma:contentTypeID="0x01010081721797C5860640AD6427A9C39167B1" ma:contentTypeVersion="21" ma:contentTypeDescription="Een nieuw document maken." ma:contentTypeScope="" ma:versionID="e1344a081ab0ba3a5a6874a830e2f4b9">
   <xsd:schema xmlns:xsd="http://www.w3.org/2001/XMLSchema" xmlns:xs="http://www.w3.org/2001/XMLSchema" xmlns:p="http://schemas.microsoft.com/office/2006/metadata/properties" xmlns:ns2="3bb2d62f-9cf3-41e4-8e26-dc347878987c" xmlns:ns3="8902adb9-d5ab-4519-807d-4f8787b35b14" targetNamespace="http://schemas.microsoft.com/office/2006/metadata/properties" ma:root="true" ma:fieldsID="15f697695118f6a7513fe898790b7107" ns2:_="" ns3:_="">
     <xsd:import namespace="3bb2d62f-9cf3-41e4-8e26-dc347878987c"/>
@@ -12381,31 +12328,36 @@
 </ct:contentTypeSchema>
 </file>
 
-<file path=customXml/item3.xml><?xml version="1.0" encoding="utf-8"?>
-<b:Sources xmlns:b="http://schemas.openxmlformats.org/officeDocument/2006/bibliography" xmlns="http://schemas.openxmlformats.org/officeDocument/2006/bibliography" SelectedStyle="\APASixthEditionOfficeOnline.xsl" StyleName="APA" Version="6"/>
-</file>
-
 <file path=customXml/item4.xml><?xml version="1.0" encoding="utf-8"?>
-<?mso-contentType ?>
-<FormTemplates xmlns="http://schemas.microsoft.com/sharepoint/v3/contenttype/forms">
-  <Display>DocumentLibraryForm</Display>
-  <Edit>DocumentLibraryForm</Edit>
-  <New>DocumentLibraryForm</New>
-</FormTemplates>
+<p:properties xmlns:p="http://schemas.microsoft.com/office/2006/metadata/properties" xmlns:xsi="http://www.w3.org/2001/XMLSchema-instance" xmlns:pc="http://schemas.microsoft.com/office/infopath/2007/PartnerControls">
+  <documentManagement>
+    <TaxCatchAll xmlns="8902adb9-d5ab-4519-807d-4f8787b35b14" xsi:nil="true"/>
+    <lcf76f155ced4ddcb4097134ff3c332f xmlns="3bb2d62f-9cf3-41e4-8e26-dc347878987c">
+      <Terms xmlns="http://schemas.microsoft.com/office/infopath/2007/PartnerControls"/>
+    </lcf76f155ced4ddcb4097134ff3c332f>
+    <opmerking xmlns="3bb2d62f-9cf3-41e4-8e26-dc347878987c" xsi:nil="true"/>
+    <Date xmlns="3bb2d62f-9cf3-41e4-8e26-dc347878987c" xsi:nil="true"/>
+  </documentManagement>
+</p:properties>
 </file>
 
 <file path=customXml/itemProps1.xml><?xml version="1.0" encoding="utf-8"?>
-<ds:datastoreItem xmlns:ds="http://schemas.openxmlformats.org/officeDocument/2006/customXml" ds:itemID="{811D0D50-5177-409B-95A0-602D3D2FD0EE}">
+<ds:datastoreItem xmlns:ds="http://schemas.openxmlformats.org/officeDocument/2006/customXml" ds:itemID="{3E366E4C-E0B2-4C13-A3ED-F3EEBE4D371C}">
   <ds:schemaRefs>
-    <ds:schemaRef ds:uri="http://schemas.microsoft.com/office/2006/metadata/properties"/>
-    <ds:schemaRef ds:uri="http://schemas.microsoft.com/office/infopath/2007/PartnerControls"/>
-    <ds:schemaRef ds:uri="8902adb9-d5ab-4519-807d-4f8787b35b14"/>
-    <ds:schemaRef ds:uri="3bb2d62f-9cf3-41e4-8e26-dc347878987c"/>
+    <ds:schemaRef ds:uri="http://schemas.microsoft.com/sharepoint/v3/contenttype/forms"/>
   </ds:schemaRefs>
 </ds:datastoreItem>
 </file>
 
 <file path=customXml/itemProps2.xml><?xml version="1.0" encoding="utf-8"?>
+<ds:datastoreItem xmlns:ds="http://schemas.openxmlformats.org/officeDocument/2006/customXml" ds:itemID="{2D17A913-F597-48A7-9E0A-898CD165CDA8}">
+  <ds:schemaRefs>
+    <ds:schemaRef ds:uri="http://schemas.openxmlformats.org/officeDocument/2006/bibliography"/>
+  </ds:schemaRefs>
+</ds:datastoreItem>
+</file>
+
+<file path=customXml/itemProps3.xml><?xml version="1.0" encoding="utf-8"?>
 <ds:datastoreItem xmlns:ds="http://schemas.openxmlformats.org/officeDocument/2006/customXml" ds:itemID="{CFF707F2-E3F0-497D-9DFC-10E434143D17}">
   <ds:schemaRefs>
     <ds:schemaRef ds:uri="http://schemas.microsoft.com/office/2006/metadata/contentType"/>
@@ -12424,18 +12376,13 @@
 </ds:datastoreItem>
 </file>
 
-<file path=customXml/itemProps3.xml><?xml version="1.0" encoding="utf-8"?>
-<ds:datastoreItem xmlns:ds="http://schemas.openxmlformats.org/officeDocument/2006/customXml" ds:itemID="{2D17A913-F597-48A7-9E0A-898CD165CDA8}">
+<file path=customXml/itemProps4.xml><?xml version="1.0" encoding="utf-8"?>
+<ds:datastoreItem xmlns:ds="http://schemas.openxmlformats.org/officeDocument/2006/customXml" ds:itemID="{811D0D50-5177-409B-95A0-602D3D2FD0EE}">
   <ds:schemaRefs>
-    <ds:schemaRef ds:uri="http://schemas.openxmlformats.org/officeDocument/2006/bibliography"/>
-  </ds:schemaRefs>
-</ds:datastoreItem>
-</file>
-
-<file path=customXml/itemProps4.xml><?xml version="1.0" encoding="utf-8"?>
-<ds:datastoreItem xmlns:ds="http://schemas.openxmlformats.org/officeDocument/2006/customXml" ds:itemID="{3E366E4C-E0B2-4C13-A3ED-F3EEBE4D371C}">
-  <ds:schemaRefs>
-    <ds:schemaRef ds:uri="http://schemas.microsoft.com/sharepoint/v3/contenttype/forms"/>
+    <ds:schemaRef ds:uri="http://schemas.microsoft.com/office/2006/metadata/properties"/>
+    <ds:schemaRef ds:uri="http://schemas.microsoft.com/office/infopath/2007/PartnerControls"/>
+    <ds:schemaRef ds:uri="8902adb9-d5ab-4519-807d-4f8787b35b14"/>
+    <ds:schemaRef ds:uri="3bb2d62f-9cf3-41e4-8e26-dc347878987c"/>
   </ds:schemaRefs>
 </ds:datastoreItem>
 </file>
</xml_diff>

<commit_message>
Half huis asset toegevoegd
</commit_message>
<xml_diff>
--- a/Style Guide -Multiplayer Tank Game 25-26.docx
+++ b/Style Guide -Multiplayer Tank Game 25-26.docx
@@ -2686,21 +2686,7 @@
                     <w:rStyle w:val="Hyperlink"/>
                     <w:noProof/>
                   </w:rPr>
-                  <w:t>Menno va</w:t>
-                </w:r>
-                <w:r>
-                  <w:rPr>
-                    <w:rStyle w:val="Hyperlink"/>
-                    <w:noProof/>
-                  </w:rPr>
-                  <w:t>n</w:t>
-                </w:r>
-                <w:r>
-                  <w:rPr>
-                    <w:rStyle w:val="Hyperlink"/>
-                    <w:noProof/>
-                  </w:rPr>
-                  <w:t xml:space="preserve"> Wijk</w:t>
+                  <w:t>Menno van Wijk</w:t>
                 </w:r>
                 <w:r>
                   <w:rPr>
@@ -3104,15 +3090,7 @@
       <w:bookmarkStart w:id="1" w:name="_Toc231933156"/>
       <w:r>
         <w:lastRenderedPageBreak/>
-        <w:t xml:space="preserve">Game Style Guide – 3D Tank Game in </w:t>
-      </w:r>
-      <w:proofErr w:type="spellStart"/>
-      <w:r>
-        <w:t>MagicaVoxel</w:t>
-      </w:r>
-      <w:proofErr w:type="spellEnd"/>
-      <w:r>
-        <w:t xml:space="preserve"> Art Style</w:t>
+        <w:t>Game Style Guide – 3D Tank Game in MagicaVoxel Art Style</w:t>
       </w:r>
       <w:bookmarkEnd w:id="1"/>
     </w:p>
@@ -3121,28 +3099,10 @@
         <w:pStyle w:val="Heading2"/>
       </w:pPr>
       <w:bookmarkStart w:id="2" w:name="_Toc231933157"/>
-      <w:proofErr w:type="spellStart"/>
-      <w:r>
-        <w:t>Algemene</w:t>
-      </w:r>
-      <w:proofErr w:type="spellEnd"/>
-      <w:r>
-        <w:t xml:space="preserve"> </w:t>
-      </w:r>
-      <w:proofErr w:type="spellStart"/>
-      <w:r>
-        <w:t>Visuele</w:t>
-      </w:r>
-      <w:proofErr w:type="spellEnd"/>
-      <w:r>
-        <w:t xml:space="preserve"> </w:t>
-      </w:r>
-      <w:proofErr w:type="spellStart"/>
-      <w:r>
-        <w:t>Richtlijnen</w:t>
+      <w:r>
+        <w:t>Algemene Visuele Richtlijnen</w:t>
       </w:r>
       <w:bookmarkEnd w:id="2"/>
-      <w:proofErr w:type="spellEnd"/>
     </w:p>
     <w:p>
       <w:pPr>
@@ -3162,79 +3122,32 @@
           <w:numId w:val="14"/>
         </w:numPr>
       </w:pPr>
-      <w:proofErr w:type="spellStart"/>
       <w:r>
         <w:rPr>
           <w:b/>
           <w:bCs/>
           <w:lang w:val="nl-NL"/>
         </w:rPr>
-        <w:t>Voxel</w:t>
-      </w:r>
-      <w:proofErr w:type="spellEnd"/>
+        <w:t>Voxel-gebaseerd</w:t>
+      </w:r>
+      <w:r>
+        <w:rPr>
+          <w:lang w:val="nl-NL"/>
+        </w:rPr>
+        <w:t xml:space="preserve">: Alle objecten bestaan uit voxels. </w:t>
+      </w:r>
+      <w:r>
+        <w:t xml:space="preserve">Gebruik </w:t>
+      </w:r>
       <w:r>
         <w:rPr>
           <w:b/>
           <w:bCs/>
-          <w:lang w:val="nl-NL"/>
-        </w:rPr>
-        <w:t>-gebaseerd</w:t>
-      </w:r>
-      <w:r>
-        <w:rPr>
-          <w:lang w:val="nl-NL"/>
-        </w:rPr>
-        <w:t xml:space="preserve">: Alle objecten bestaan uit </w:t>
-      </w:r>
-      <w:proofErr w:type="spellStart"/>
-      <w:r>
-        <w:rPr>
-          <w:lang w:val="nl-NL"/>
-        </w:rPr>
-        <w:t>voxels</w:t>
-      </w:r>
-      <w:proofErr w:type="spellEnd"/>
-      <w:r>
-        <w:rPr>
-          <w:lang w:val="nl-NL"/>
-        </w:rPr>
-        <w:t xml:space="preserve">. </w:t>
-      </w:r>
-      <w:proofErr w:type="spellStart"/>
-      <w:r>
-        <w:t>Gebruik</w:t>
-      </w:r>
-      <w:proofErr w:type="spellEnd"/>
-      <w:r>
-        <w:t xml:space="preserve"> </w:t>
-      </w:r>
-      <w:proofErr w:type="spellStart"/>
-      <w:r>
-        <w:rPr>
-          <w:b/>
-          <w:bCs/>
         </w:rPr>
         <w:t>MagicaVoxel</w:t>
       </w:r>
-      <w:proofErr w:type="spellEnd"/>
-      <w:r>
-        <w:t xml:space="preserve"> </w:t>
-      </w:r>
-      <w:proofErr w:type="spellStart"/>
-      <w:r>
-        <w:t>voor</w:t>
-      </w:r>
-      <w:proofErr w:type="spellEnd"/>
-      <w:r>
-        <w:t xml:space="preserve"> </w:t>
-      </w:r>
-      <w:proofErr w:type="spellStart"/>
-      <w:r>
-        <w:t>modellering</w:t>
-      </w:r>
-      <w:proofErr w:type="spellEnd"/>
-      <w:r>
-        <w:t>.</w:t>
+      <w:r>
+        <w:t xml:space="preserve"> voor modellering.</w:t>
       </w:r>
     </w:p>
     <w:p>
@@ -3260,21 +3173,7 @@
         <w:rPr>
           <w:lang w:val="nl-NL"/>
         </w:rPr>
-        <w:t xml:space="preserve">: Houd modellen compact en gestileerd. Gebruik </w:t>
-      </w:r>
-      <w:proofErr w:type="spellStart"/>
-      <w:r>
-        <w:rPr>
-          <w:lang w:val="nl-NL"/>
-        </w:rPr>
-        <w:t>voxel</w:t>
-      </w:r>
-      <w:proofErr w:type="spellEnd"/>
-      <w:r>
-        <w:rPr>
-          <w:lang w:val="nl-NL"/>
-        </w:rPr>
-        <w:t xml:space="preserve">-eenheden tussen </w:t>
+        <w:t xml:space="preserve">: Houd modellen compact en gestileerd. Gebruik voxel-eenheden tussen </w:t>
       </w:r>
       <w:r>
         <w:rPr>
@@ -3354,34 +3253,14 @@
         </w:rPr>
         <w:t xml:space="preserve"> of </w:t>
       </w:r>
-      <w:proofErr w:type="spellStart"/>
       <w:r>
         <w:rPr>
           <w:b/>
           <w:bCs/>
           <w:lang w:val="nl-NL"/>
         </w:rPr>
-        <w:t>gradient</w:t>
-      </w:r>
-      <w:proofErr w:type="spellEnd"/>
-      <w:r>
-        <w:rPr>
-          <w:b/>
-          <w:bCs/>
-          <w:lang w:val="nl-NL"/>
-        </w:rPr>
-        <w:t xml:space="preserve"> </w:t>
-      </w:r>
-      <w:proofErr w:type="spellStart"/>
-      <w:r>
-        <w:rPr>
-          <w:b/>
-          <w:bCs/>
-          <w:lang w:val="nl-NL"/>
-        </w:rPr>
-        <w:t>shading</w:t>
-      </w:r>
-      <w:proofErr w:type="spellEnd"/>
+        <w:t>gradient shading</w:t>
+      </w:r>
       <w:r>
         <w:rPr>
           <w:lang w:val="nl-NL"/>
@@ -3409,54 +3288,10 @@
         <w:rPr>
           <w:lang w:val="nl-NL"/>
         </w:rPr>
-        <w:t xml:space="preserve">: Zacht </w:t>
-      </w:r>
-      <w:proofErr w:type="spellStart"/>
-      <w:r>
-        <w:rPr>
-          <w:lang w:val="nl-NL"/>
-        </w:rPr>
-        <w:t>ambient</w:t>
-      </w:r>
-      <w:proofErr w:type="spellEnd"/>
-      <w:r>
-        <w:rPr>
-          <w:lang w:val="nl-NL"/>
-        </w:rPr>
-        <w:t xml:space="preserve"> </w:t>
-      </w:r>
-      <w:proofErr w:type="spellStart"/>
-      <w:r>
-        <w:rPr>
-          <w:lang w:val="nl-NL"/>
-        </w:rPr>
-        <w:t>lighting</w:t>
-      </w:r>
-      <w:proofErr w:type="spellEnd"/>
-      <w:r>
-        <w:rPr>
-          <w:lang w:val="nl-NL"/>
-        </w:rPr>
-        <w:t xml:space="preserve"> + directionele lichtbron. </w:t>
-      </w:r>
-      <w:r>
-        <w:t xml:space="preserve">Geen </w:t>
-      </w:r>
-      <w:proofErr w:type="spellStart"/>
-      <w:r>
-        <w:t>zware</w:t>
-      </w:r>
-      <w:proofErr w:type="spellEnd"/>
-      <w:r>
-        <w:t xml:space="preserve"> </w:t>
-      </w:r>
-      <w:proofErr w:type="spellStart"/>
-      <w:r>
-        <w:t>schaduwen</w:t>
-      </w:r>
-      <w:proofErr w:type="spellEnd"/>
-      <w:r>
-        <w:t>.</w:t>
+        <w:t xml:space="preserve">: Zacht ambient lighting + directionele lichtbron. </w:t>
+      </w:r>
+      <w:r>
+        <w:t>Geen zware schaduwen.</w:t>
       </w:r>
     </w:p>
     <w:p>
@@ -3466,6 +3301,9 @@
           <w:ilvl w:val="0"/>
           <w:numId w:val="14"/>
         </w:numPr>
+        <w:rPr>
+          <w:lang w:val="nl-NL"/>
+        </w:rPr>
       </w:pPr>
       <w:r>
         <w:rPr>
@@ -3479,62 +3317,22 @@
         <w:rPr>
           <w:lang w:val="de-DE"/>
         </w:rPr>
-        <w:t xml:space="preserve">: Flat, </w:t>
-      </w:r>
-      <w:proofErr w:type="spellStart"/>
-      <w:r>
-        <w:rPr>
-          <w:lang w:val="de-DE"/>
-        </w:rPr>
-        <w:t>pixel</w:t>
-      </w:r>
-      <w:proofErr w:type="spellEnd"/>
-      <w:r>
-        <w:rPr>
-          <w:lang w:val="de-DE"/>
-        </w:rPr>
-        <w:t xml:space="preserve"> art-</w:t>
-      </w:r>
-      <w:proofErr w:type="spellStart"/>
-      <w:r>
-        <w:rPr>
-          <w:lang w:val="de-DE"/>
-        </w:rPr>
-        <w:t>geïnspireerd</w:t>
-      </w:r>
-      <w:proofErr w:type="spellEnd"/>
-      <w:r>
-        <w:rPr>
-          <w:lang w:val="de-DE"/>
-        </w:rPr>
-        <w:t xml:space="preserve">. </w:t>
-      </w:r>
-      <w:proofErr w:type="spellStart"/>
-      <w:r>
-        <w:t>Minimalistisch</w:t>
-      </w:r>
-      <w:proofErr w:type="spellEnd"/>
-      <w:r>
-        <w:t xml:space="preserve"> </w:t>
-      </w:r>
-      <w:proofErr w:type="spellStart"/>
-      <w:r>
-        <w:t>en</w:t>
-      </w:r>
-      <w:proofErr w:type="spellEnd"/>
-      <w:r>
-        <w:t xml:space="preserve"> </w:t>
-      </w:r>
-      <w:proofErr w:type="spellStart"/>
-      <w:r>
-        <w:t>duidelijk</w:t>
-      </w:r>
-      <w:proofErr w:type="spellEnd"/>
-      <w:r>
-        <w:t>.</w:t>
-      </w:r>
-    </w:p>
-    <w:p/>
+        <w:t xml:space="preserve">: Flat, pixel art-geïnspireerd. </w:t>
+      </w:r>
+      <w:r>
+        <w:rPr>
+          <w:lang w:val="nl-NL"/>
+        </w:rPr>
+        <w:t>Minimalistisch en duidelijk.</w:t>
+      </w:r>
+    </w:p>
+    <w:p>
+      <w:pPr>
+        <w:rPr>
+          <w:lang w:val="nl-NL"/>
+        </w:rPr>
+      </w:pPr>
+    </w:p>
     <w:p>
       <w:pPr>
         <w:pStyle w:val="Heading2"/>
@@ -3607,11 +3405,9 @@
       <w:pPr>
         <w:pStyle w:val="Heading4"/>
       </w:pPr>
-      <w:proofErr w:type="spellStart"/>
       <w:r>
         <w:t>Afmetingen</w:t>
       </w:r>
-      <w:proofErr w:type="spellEnd"/>
     </w:p>
     <w:p>
       <w:pPr>
@@ -3632,11 +3428,9 @@
       <w:pPr>
         <w:pStyle w:val="Heading4"/>
       </w:pPr>
-      <w:proofErr w:type="spellStart"/>
       <w:r>
         <w:t>Onderdelen</w:t>
       </w:r>
-      <w:proofErr w:type="spellEnd"/>
     </w:p>
     <w:p>
       <w:pPr>
@@ -3661,21 +3455,7 @@
         <w:rPr>
           <w:lang w:val="nl-NL"/>
         </w:rPr>
-        <w:t xml:space="preserve">: Draaibaar onderdeel (los model of als draaibare </w:t>
-      </w:r>
-      <w:proofErr w:type="spellStart"/>
-      <w:r>
-        <w:rPr>
-          <w:lang w:val="nl-NL"/>
-        </w:rPr>
-        <w:t>parent</w:t>
-      </w:r>
-      <w:proofErr w:type="spellEnd"/>
-      <w:r>
-        <w:rPr>
-          <w:lang w:val="nl-NL"/>
-        </w:rPr>
-        <w:t>).</w:t>
+        <w:t>: Draaibaar onderdeel (los model of als draaibare parent).</w:t>
       </w:r>
     </w:p>
     <w:p>
@@ -3798,7 +3578,6 @@
                 <w:lang w:val="nl-NL"/>
               </w:rPr>
             </w:pPr>
-            <w:proofErr w:type="spellStart"/>
             <w:r>
               <w:rPr>
                 <w:b/>
@@ -3806,7 +3585,6 @@
               </w:rPr>
               <w:t>Hoofdkleur</w:t>
             </w:r>
-            <w:proofErr w:type="spellEnd"/>
           </w:p>
         </w:tc>
         <w:tc>
@@ -3820,7 +3598,6 @@
                 <w:lang w:val="nl-NL"/>
               </w:rPr>
             </w:pPr>
-            <w:proofErr w:type="spellStart"/>
             <w:r>
               <w:rPr>
                 <w:b/>
@@ -3828,7 +3605,6 @@
               </w:rPr>
               <w:t>Secundair</w:t>
             </w:r>
-            <w:proofErr w:type="spellEnd"/>
           </w:p>
         </w:tc>
       </w:tr>
@@ -3952,33 +3728,11 @@
           <w:numId w:val="19"/>
         </w:numPr>
       </w:pPr>
-      <w:proofErr w:type="spellStart"/>
-      <w:r>
-        <w:rPr>
-          <w:lang w:val="nl-NL"/>
-        </w:rPr>
-        <w:t>Blokkerige</w:t>
-      </w:r>
-      <w:proofErr w:type="spellEnd"/>
-      <w:r>
-        <w:rPr>
-          <w:lang w:val="nl-NL"/>
-        </w:rPr>
-        <w:t xml:space="preserve"> wereld opgebouwd uit </w:t>
-      </w:r>
-      <w:proofErr w:type="spellStart"/>
-      <w:r>
-        <w:rPr>
-          <w:lang w:val="nl-NL"/>
-        </w:rPr>
-        <w:t>voxel-terrain</w:t>
-      </w:r>
-      <w:proofErr w:type="spellEnd"/>
-      <w:r>
-        <w:rPr>
-          <w:lang w:val="nl-NL"/>
-        </w:rPr>
-        <w:t xml:space="preserve"> (bijv. </w:t>
+      <w:r>
+        <w:rPr>
+          <w:lang w:val="nl-NL"/>
+        </w:rPr>
+        <w:t xml:space="preserve">Blokkerige wereld opgebouwd uit voxel-terrain (bijv. </w:t>
       </w:r>
       <w:r>
         <w:t>64x64x32 chunks).</w:t>
@@ -3999,21 +3753,7 @@
         <w:rPr>
           <w:lang w:val="nl-NL"/>
         </w:rPr>
-        <w:t xml:space="preserve">Alles in </w:t>
-      </w:r>
-      <w:proofErr w:type="spellStart"/>
-      <w:r>
-        <w:rPr>
-          <w:lang w:val="nl-NL"/>
-        </w:rPr>
-        <w:t>MagicaVoxel</w:t>
-      </w:r>
-      <w:proofErr w:type="spellEnd"/>
-      <w:r>
-        <w:rPr>
-          <w:lang w:val="nl-NL"/>
-        </w:rPr>
-        <w:t xml:space="preserve"> stijl – gebouwen, rotsen, bomen.</w:t>
+        <w:t>Alles in MagicaVoxel stijl – gebouwen, rotsen, bomen.</w:t>
       </w:r>
     </w:p>
     <w:p>
@@ -4188,16 +3928,8 @@
         <w:rPr>
           <w:lang w:val="nl-NL"/>
         </w:rPr>
-        <w:t xml:space="preserve"> </w:t>
-      </w:r>
-      <w:proofErr w:type="spellStart"/>
-      <w:r>
-        <w:rPr>
-          <w:lang w:val="nl-NL"/>
-        </w:rPr>
-        <w:t>Miska</w:t>
-      </w:r>
-      <w:proofErr w:type="spellEnd"/>
+        <w:t xml:space="preserve"> Miska</w:t>
+      </w:r>
     </w:p>
     <w:p>
       <w:pPr>
@@ -4220,21 +3952,7 @@
         <w:rPr>
           <w:lang w:val="nl-NL"/>
         </w:rPr>
-        <w:t xml:space="preserve">berk, </w:t>
-      </w:r>
-      <w:proofErr w:type="spellStart"/>
-      <w:r>
-        <w:rPr>
-          <w:lang w:val="nl-NL"/>
-        </w:rPr>
-        <w:t>denneboom</w:t>
-      </w:r>
-      <w:proofErr w:type="spellEnd"/>
-      <w:r>
-        <w:rPr>
-          <w:lang w:val="nl-NL"/>
-        </w:rPr>
-        <w:t>, appelboom)</w:t>
+        <w:t>berk, denneboom, appelboom)</w:t>
       </w:r>
     </w:p>
     <w:p>
@@ -4249,13 +3967,8 @@
         </w:rPr>
       </w:pPr>
       <w:r>
-        <w:t xml:space="preserve">Park </w:t>
-      </w:r>
-      <w:proofErr w:type="spellStart"/>
-      <w:r>
-        <w:t>bankje</w:t>
-      </w:r>
-      <w:proofErr w:type="spellEnd"/>
+        <w:t>Park bankje</w:t>
+      </w:r>
       <w:r>
         <w:t xml:space="preserve"> </w:t>
       </w:r>
@@ -4275,13 +3988,8 @@
         </w:numPr>
       </w:pPr>
       <w:r>
-        <w:t xml:space="preserve">Anti-tank </w:t>
-      </w:r>
-      <w:proofErr w:type="spellStart"/>
-      <w:r>
-        <w:t>obstakel</w:t>
-      </w:r>
-      <w:proofErr w:type="spellEnd"/>
+        <w:t>Anti-tank obstakel</w:t>
+      </w:r>
       <w:r>
         <w:t xml:space="preserve"> </w:t>
       </w:r>
@@ -4306,39 +4014,17 @@
           <w:lang w:val="nl-NL"/>
         </w:rPr>
       </w:pPr>
-      <w:proofErr w:type="spellStart"/>
-      <w:r>
-        <w:rPr>
-          <w:lang w:val="nl-NL"/>
-        </w:rPr>
-        <w:t>Ammo</w:t>
-      </w:r>
-      <w:proofErr w:type="spellEnd"/>
-      <w:r>
-        <w:rPr>
-          <w:lang w:val="nl-NL"/>
-        </w:rPr>
-        <w:t xml:space="preserve"> pack &amp; </w:t>
-      </w:r>
-      <w:proofErr w:type="spellStart"/>
-      <w:r>
-        <w:rPr>
-          <w:lang w:val="nl-NL"/>
-        </w:rPr>
-        <w:t>Bullet</w:t>
-      </w:r>
-      <w:r>
-        <w:rPr>
-          <w:lang w:val="nl-NL"/>
-        </w:rPr>
-        <w:t>s</w:t>
-      </w:r>
-      <w:proofErr w:type="spellEnd"/>
-      <w:r>
-        <w:rPr>
-          <w:lang w:val="nl-NL"/>
-        </w:rPr>
-        <w:t xml:space="preserve"> (3 verschillende groottes en vormen)</w:t>
+      <w:r>
+        <w:rPr>
+          <w:lang w:val="nl-NL"/>
+        </w:rPr>
+        <w:t>Ammo pack &amp; Bullet</w:t>
+      </w:r>
+      <w:r>
+        <w:rPr>
+          <w:lang w:val="nl-NL"/>
+        </w:rPr>
+        <w:t>s (3 verschillende groottes en vormen)</w:t>
       </w:r>
       <w:r>
         <w:rPr>
@@ -4356,16 +4042,8 @@
         <w:rPr>
           <w:lang w:val="nl-NL"/>
         </w:rPr>
-        <w:t xml:space="preserve"> </w:t>
-      </w:r>
-      <w:proofErr w:type="spellStart"/>
-      <w:r>
-        <w:rPr>
-          <w:lang w:val="nl-NL"/>
-        </w:rPr>
-        <w:t>Mika</w:t>
-      </w:r>
-      <w:proofErr w:type="spellEnd"/>
+        <w:t xml:space="preserve"> Mika</w:t>
+      </w:r>
     </w:p>
     <w:p>
       <w:pPr>
@@ -4546,19 +4224,11 @@
           <w:lang w:val="nl-NL"/>
         </w:rPr>
       </w:pPr>
-      <w:proofErr w:type="spellStart"/>
-      <w:r>
-        <w:rPr>
-          <w:lang w:val="nl-NL"/>
-        </w:rPr>
-        <w:t>Powerups</w:t>
-      </w:r>
-      <w:proofErr w:type="spellEnd"/>
-      <w:r>
-        <w:rPr>
-          <w:lang w:val="nl-NL"/>
-        </w:rPr>
-        <w:t xml:space="preserve"> </w:t>
+      <w:r>
+        <w:rPr>
+          <w:lang w:val="nl-NL"/>
+        </w:rPr>
+        <w:t xml:space="preserve">Powerups </w:t>
       </w:r>
     </w:p>
     <w:p>
@@ -4572,14 +4242,12 @@
           <w:lang w:val="nl-NL"/>
         </w:rPr>
       </w:pPr>
-      <w:proofErr w:type="spellStart"/>
       <w:r>
         <w:rPr>
           <w:lang w:val="nl-NL"/>
         </w:rPr>
         <w:t>Barriere</w:t>
       </w:r>
-      <w:proofErr w:type="spellEnd"/>
       <w:r>
         <w:rPr>
           <w:lang w:val="nl-NL"/>
@@ -5014,13 +4682,8 @@
         <w:pStyle w:val="Heading2"/>
       </w:pPr>
       <w:bookmarkStart w:id="10" w:name="_Toc231933167"/>
-      <w:proofErr w:type="spellStart"/>
-      <w:r>
-        <w:t>Effecten</w:t>
-      </w:r>
-      <w:proofErr w:type="spellEnd"/>
-      <w:r>
-        <w:t xml:space="preserve"> (FX)</w:t>
+      <w:r>
+        <w:t>Effecten (FX)</w:t>
       </w:r>
       <w:bookmarkEnd w:id="10"/>
     </w:p>
@@ -5029,12 +4692,10 @@
         <w:pStyle w:val="Heading3"/>
       </w:pPr>
       <w:bookmarkStart w:id="11" w:name="_Toc231933168"/>
-      <w:proofErr w:type="spellStart"/>
       <w:r>
         <w:t>Explosies</w:t>
       </w:r>
       <w:bookmarkEnd w:id="11"/>
-      <w:proofErr w:type="spellEnd"/>
     </w:p>
     <w:p>
       <w:pPr>
@@ -5045,39 +4706,7 @@
         </w:numPr>
       </w:pPr>
       <w:r>
-        <w:t>Stylized voxel-</w:t>
-      </w:r>
-      <w:proofErr w:type="spellStart"/>
-      <w:r>
-        <w:t>explosies</w:t>
-      </w:r>
-      <w:proofErr w:type="spellEnd"/>
-      <w:r>
-        <w:t xml:space="preserve"> (</w:t>
-      </w:r>
-      <w:proofErr w:type="spellStart"/>
-      <w:r>
-        <w:t>geanimeerde</w:t>
-      </w:r>
-      <w:proofErr w:type="spellEnd"/>
-      <w:r>
-        <w:t xml:space="preserve"> sprites of </w:t>
-      </w:r>
-      <w:proofErr w:type="spellStart"/>
-      <w:r>
-        <w:t>kleine</w:t>
-      </w:r>
-      <w:proofErr w:type="spellEnd"/>
-      <w:r>
-        <w:t xml:space="preserve"> voxel-</w:t>
-      </w:r>
-      <w:proofErr w:type="spellStart"/>
-      <w:r>
-        <w:t>animatie</w:t>
-      </w:r>
-      <w:proofErr w:type="spellEnd"/>
-      <w:r>
-        <w:t>)</w:t>
+        <w:t>Stylized voxel-explosies (geanimeerde sprites of kleine voxel-animatie)</w:t>
       </w:r>
     </w:p>
     <w:p>
@@ -5129,29 +4758,8 @@
         </w:numPr>
       </w:pPr>
       <w:r>
-        <w:t xml:space="preserve">Tank barrel </w:t>
-      </w:r>
-      <w:proofErr w:type="spellStart"/>
-      <w:r>
-        <w:t>schokt</w:t>
-      </w:r>
-      <w:proofErr w:type="spellEnd"/>
-      <w:r>
-        <w:t xml:space="preserve"> </w:t>
-      </w:r>
-      <w:proofErr w:type="spellStart"/>
-      <w:r>
-        <w:t>iets</w:t>
-      </w:r>
-      <w:proofErr w:type="spellEnd"/>
-      <w:r>
-        <w:t xml:space="preserve"> </w:t>
-      </w:r>
-      <w:proofErr w:type="spellStart"/>
-      <w:r>
-        <w:t>achteruit</w:t>
-      </w:r>
-      <w:proofErr w:type="spellEnd"/>
+        <w:t>Tank barrel schokt iets achteruit</w:t>
+      </w:r>
     </w:p>
     <w:p>
       <w:pPr>
@@ -5178,49 +4786,7 @@
         <w:rPr>
           <w:lang w:val="nl-NL"/>
         </w:rPr>
-        <w:t xml:space="preserve">Grijs-witte </w:t>
-      </w:r>
-      <w:proofErr w:type="spellStart"/>
-      <w:r>
-        <w:rPr>
-          <w:lang w:val="nl-NL"/>
-        </w:rPr>
-        <w:t>puffs</w:t>
-      </w:r>
-      <w:proofErr w:type="spellEnd"/>
-      <w:r>
-        <w:rPr>
-          <w:lang w:val="nl-NL"/>
-        </w:rPr>
-        <w:t xml:space="preserve">, </w:t>
-      </w:r>
-      <w:proofErr w:type="spellStart"/>
-      <w:r>
-        <w:rPr>
-          <w:lang w:val="nl-NL"/>
-        </w:rPr>
-        <w:t>voxel</w:t>
-      </w:r>
-      <w:proofErr w:type="spellEnd"/>
-      <w:r>
-        <w:rPr>
-          <w:lang w:val="nl-NL"/>
-        </w:rPr>
-        <w:t xml:space="preserve"> of </w:t>
-      </w:r>
-      <w:proofErr w:type="spellStart"/>
-      <w:r>
-        <w:rPr>
-          <w:lang w:val="nl-NL"/>
-        </w:rPr>
-        <w:t>sprite</w:t>
-      </w:r>
-      <w:proofErr w:type="spellEnd"/>
-      <w:r>
-        <w:rPr>
-          <w:lang w:val="nl-NL"/>
-        </w:rPr>
-        <w:t xml:space="preserve"> gebaseerd</w:t>
+        <w:t>Grijs-witte puffs, voxel of sprite gebaseerd</w:t>
       </w:r>
     </w:p>
     <w:p>
@@ -5252,21 +4818,7 @@
         <w:rPr>
           <w:rStyle w:val="Heading2Char"/>
         </w:rPr>
-        <w:t>Audio Style (</w:t>
-      </w:r>
-      <w:proofErr w:type="spellStart"/>
-      <w:r>
-        <w:rPr>
-          <w:rStyle w:val="Heading2Char"/>
-        </w:rPr>
-        <w:t>optioneel</w:t>
-      </w:r>
-      <w:proofErr w:type="spellEnd"/>
-      <w:r>
-        <w:rPr>
-          <w:rStyle w:val="Heading2Char"/>
-        </w:rPr>
-        <w:t>)</w:t>
+        <w:t>Audio Style (optioneel)</w:t>
       </w:r>
       <w:bookmarkEnd w:id="14"/>
     </w:p>
@@ -5296,37 +4848,8 @@
           <w:numId w:val="18"/>
         </w:numPr>
       </w:pPr>
-      <w:proofErr w:type="spellStart"/>
-      <w:r>
-        <w:t>Zware</w:t>
-      </w:r>
-      <w:proofErr w:type="spellEnd"/>
-      <w:r>
-        <w:t xml:space="preserve"> </w:t>
-      </w:r>
-      <w:proofErr w:type="spellStart"/>
-      <w:r>
-        <w:t>mechanische</w:t>
-      </w:r>
-      <w:proofErr w:type="spellEnd"/>
-      <w:r>
-        <w:t xml:space="preserve"> </w:t>
-      </w:r>
-      <w:proofErr w:type="spellStart"/>
-      <w:r>
-        <w:t>klanken</w:t>
-      </w:r>
-      <w:proofErr w:type="spellEnd"/>
-      <w:r>
-        <w:t xml:space="preserve"> </w:t>
-      </w:r>
-      <w:proofErr w:type="spellStart"/>
-      <w:r>
-        <w:t>voor</w:t>
-      </w:r>
-      <w:proofErr w:type="spellEnd"/>
-      <w:r>
-        <w:t xml:space="preserve"> tanks</w:t>
+      <w:r>
+        <w:t>Zware mechanische klanken voor tanks</w:t>
       </w:r>
     </w:p>
     <w:p>
@@ -5338,21 +4861,8 @@
         </w:numPr>
       </w:pPr>
       <w:r>
-        <w:t>Cartoon-</w:t>
-      </w:r>
-      <w:proofErr w:type="spellStart"/>
-      <w:r>
-        <w:t>achtige</w:t>
-      </w:r>
-      <w:proofErr w:type="spellEnd"/>
-      <w:r>
-        <w:t xml:space="preserve"> </w:t>
-      </w:r>
-      <w:proofErr w:type="spellStart"/>
-      <w:r>
-        <w:t>ontploffingseffecten</w:t>
-      </w:r>
-      <w:proofErr w:type="spellEnd"/>
+        <w:t>Cartoon-achtige ontploffingseffecten</w:t>
+      </w:r>
     </w:p>
     <w:p>
       <w:pPr>
@@ -5380,9 +4890,6 @@
     </w:p>
     <w:p>
       <w:r>
-        <w:rPr>
-          <w:lang w:val="nl-NL"/>
-        </w:rPr>
         <w:t>Asset: Anti-tank obstakel</w:t>
       </w:r>
       <w:r>
@@ -5407,6 +4914,9 @@
     </w:p>
     <w:p>
       <w:r>
+        <w:rPr>
+          <w:noProof/>
+        </w:rPr>
         <w:drawing>
           <wp:inline distT="0" distB="0" distL="0" distR="0" wp14:anchorId="3E6EBEBC" wp14:editId="4FD90B3A">
             <wp:extent cx="2819400" cy="2324100"/>
@@ -5483,21 +4993,7 @@
         <w:rPr>
           <w:lang w:val="nl-NL"/>
         </w:rPr>
-        <w:t>Kleurenpalet (</w:t>
-      </w:r>
-      <w:proofErr w:type="spellStart"/>
-      <w:r>
-        <w:rPr>
-          <w:lang w:val="nl-NL"/>
-        </w:rPr>
-        <w:t>hex</w:t>
-      </w:r>
-      <w:proofErr w:type="spellEnd"/>
-      <w:r>
-        <w:rPr>
-          <w:lang w:val="nl-NL"/>
-        </w:rPr>
-        <w:t xml:space="preserve"> nummers): 4A4A4A </w:t>
+        <w:t>Kleurenpalet (hex nummers): 4A4A4A </w:t>
       </w:r>
     </w:p>
     <w:p>
@@ -5623,21 +5119,7 @@
         <w:rPr>
           <w:lang w:val="nl-NL"/>
         </w:rPr>
-        <w:t>Kleurenpalet (</w:t>
-      </w:r>
-      <w:proofErr w:type="spellStart"/>
-      <w:r>
-        <w:rPr>
-          <w:lang w:val="nl-NL"/>
-        </w:rPr>
-        <w:t>hex</w:t>
-      </w:r>
-      <w:proofErr w:type="spellEnd"/>
-      <w:r>
-        <w:rPr>
-          <w:lang w:val="nl-NL"/>
-        </w:rPr>
-        <w:t xml:space="preserve"> nummers):</w:t>
+        <w:t>Kleurenpalet (hex nummers):</w:t>
       </w:r>
     </w:p>
     <w:p>
@@ -5705,20 +5187,12 @@
         </w:rPr>
       </w:pPr>
       <w:bookmarkStart w:id="17" w:name="_Toc231933174"/>
-      <w:proofErr w:type="spellStart"/>
       <w:r>
         <w:rPr>
           <w:lang w:val="nl-NL"/>
         </w:rPr>
         <w:lastRenderedPageBreak/>
-        <w:t>Miska</w:t>
-      </w:r>
-      <w:proofErr w:type="spellEnd"/>
-      <w:r>
-        <w:rPr>
-          <w:lang w:val="nl-NL"/>
-        </w:rPr>
-        <w:t xml:space="preserve"> van den Brink</w:t>
+        <w:t>Miska van den Brink</w:t>
       </w:r>
       <w:bookmarkEnd w:id="17"/>
     </w:p>
@@ -5763,6 +5237,7 @@
       </w:pPr>
       <w:r>
         <w:rPr>
+          <w:noProof/>
           <w:lang w:val="nl-NL"/>
         </w:rPr>
         <w:drawing>
@@ -5825,21 +5300,7 @@
         <w:rPr>
           <w:lang w:val="nl-NL"/>
         </w:rPr>
-        <w:t>Kleurenpalet (</w:t>
-      </w:r>
-      <w:proofErr w:type="spellStart"/>
-      <w:r>
-        <w:rPr>
-          <w:lang w:val="nl-NL"/>
-        </w:rPr>
-        <w:t>hex</w:t>
-      </w:r>
-      <w:proofErr w:type="spellEnd"/>
-      <w:r>
-        <w:rPr>
-          <w:lang w:val="nl-NL"/>
-        </w:rPr>
-        <w:t xml:space="preserve"> nummers):</w:t>
+        <w:t>Kleurenpalet (hex nummers):</w:t>
       </w:r>
     </w:p>
     <w:p>
@@ -5908,9 +5369,15 @@
     <w:p>
       <w:pPr>
         <w:pStyle w:val="Heading2"/>
+        <w:rPr>
+          <w:lang w:val="nl-NL"/>
+        </w:rPr>
       </w:pPr>
       <w:bookmarkStart w:id="18" w:name="_Toc231933175"/>
       <w:r>
+        <w:rPr>
+          <w:lang w:val="nl-NL"/>
+        </w:rPr>
         <w:lastRenderedPageBreak/>
         <w:t>Thomas Dijkstra</w:t>
       </w:r>
@@ -5979,21 +5446,7 @@
         <w:rPr>
           <w:lang w:val="nl-NL"/>
         </w:rPr>
-        <w:t>Kleurenpalet (</w:t>
-      </w:r>
-      <w:proofErr w:type="spellStart"/>
-      <w:r>
-        <w:rPr>
-          <w:lang w:val="nl-NL"/>
-        </w:rPr>
-        <w:t>hex</w:t>
-      </w:r>
-      <w:proofErr w:type="spellEnd"/>
-      <w:r>
-        <w:rPr>
-          <w:lang w:val="nl-NL"/>
-        </w:rPr>
-        <w:t xml:space="preserve"> nummers):</w:t>
+        <w:t>Kleurenpalet (hex nummers):</w:t>
       </w:r>
     </w:p>
     <w:p>
@@ -6063,15 +5516,7 @@
       </w:pPr>
     </w:p>
     <w:p>
-      <w:pPr>
-        <w:rPr>
-          <w:lang w:val="nl-NL"/>
-        </w:rPr>
-      </w:pPr>
-      <w:r>
-        <w:rPr>
-          <w:lang w:val="nl-NL"/>
-        </w:rPr>
+      <w:r>
         <w:t>Feedback klasgenoot:</w:t>
       </w:r>
     </w:p>
@@ -6082,13 +5527,9 @@
           <w:color w:val="0F4761" w:themeColor="accent1" w:themeShade="BF"/>
           <w:sz w:val="32"/>
           <w:szCs w:val="32"/>
-          <w:lang w:val="nl-NL"/>
-        </w:rPr>
-      </w:pPr>
-      <w:r>
-        <w:rPr>
-          <w:lang w:val="nl-NL"/>
-        </w:rPr>
+        </w:rPr>
+      </w:pPr>
+      <w:r>
         <w:br w:type="page"/>
       </w:r>
     </w:p>
@@ -6099,35 +5540,16 @@
       <w:bookmarkStart w:id="19" w:name="_Toc231933176"/>
       <w:r>
         <w:lastRenderedPageBreak/>
-        <w:t xml:space="preserve">Myrthe </w:t>
-      </w:r>
-      <w:proofErr w:type="spellStart"/>
-      <w:r>
-        <w:t>Dissevelt</w:t>
+        <w:t>Myrthe Dissevelt</w:t>
       </w:r>
       <w:bookmarkEnd w:id="19"/>
-      <w:proofErr w:type="spellEnd"/>
-    </w:p>
-    <w:p>
-      <w:pPr>
-        <w:rPr>
-          <w:lang w:val="nl-NL"/>
-        </w:rPr>
-      </w:pPr>
-      <w:r>
-        <w:rPr>
-          <w:lang w:val="nl-NL"/>
-        </w:rPr>
+    </w:p>
+    <w:p>
+      <w:r>
         <w:t>Asset:</w:t>
       </w:r>
     </w:p>
-    <w:p>
-      <w:pPr>
-        <w:rPr>
-          <w:lang w:val="nl-NL"/>
-        </w:rPr>
-      </w:pPr>
-    </w:p>
+    <w:p/>
     <w:p>
       <w:pPr>
         <w:rPr>
@@ -6158,21 +5580,7 @@
         <w:rPr>
           <w:lang w:val="nl-NL"/>
         </w:rPr>
-        <w:t>Kleurenpalet (</w:t>
-      </w:r>
-      <w:proofErr w:type="spellStart"/>
-      <w:r>
-        <w:rPr>
-          <w:lang w:val="nl-NL"/>
-        </w:rPr>
-        <w:t>hex</w:t>
-      </w:r>
-      <w:proofErr w:type="spellEnd"/>
-      <w:r>
-        <w:rPr>
-          <w:lang w:val="nl-NL"/>
-        </w:rPr>
-        <w:t xml:space="preserve"> nummers):</w:t>
+        <w:t>Kleurenpalet (hex nummers):</w:t>
       </w:r>
     </w:p>
     <w:p>
@@ -6235,9 +5643,15 @@
     <w:p>
       <w:pPr>
         <w:pStyle w:val="Heading2"/>
+        <w:rPr>
+          <w:lang w:val="nl-NL"/>
+        </w:rPr>
       </w:pPr>
       <w:bookmarkStart w:id="20" w:name="_Toc231933177"/>
       <w:r>
+        <w:rPr>
+          <w:lang w:val="nl-NL"/>
+        </w:rPr>
         <w:lastRenderedPageBreak/>
         <w:t>Joeri van Drunen</w:t>
       </w:r>
@@ -6257,7 +5671,15 @@
       </w:r>
     </w:p>
     <w:p>
-      <w:r>
+      <w:pPr>
+        <w:rPr>
+          <w:lang w:val="nl-NL"/>
+        </w:rPr>
+      </w:pPr>
+      <w:r>
+        <w:rPr>
+          <w:lang w:val="nl-NL"/>
+        </w:rPr>
         <w:t>Barriere</w:t>
       </w:r>
     </w:p>
@@ -6282,6 +5704,7 @@
       </w:pPr>
       <w:r>
         <w:rPr>
+          <w:noProof/>
           <w:lang w:val="nl-NL"/>
         </w:rPr>
         <w:drawing>
@@ -6333,46 +5756,24 @@
           </wp:inline>
         </w:drawing>
       </w:r>
-      <w:proofErr w:type="spellStart"/>
-      <w:r>
-        <w:rPr>
-          <w:lang w:val="nl-NL"/>
-        </w:rPr>
-        <w:t>betonne</w:t>
-      </w:r>
-      <w:proofErr w:type="spellEnd"/>
-      <w:r>
-        <w:rPr>
-          <w:lang w:val="nl-NL"/>
-        </w:rPr>
-        <w:t xml:space="preserve"> barrière met de kleur geel zwart</w:t>
-      </w:r>
-    </w:p>
-    <w:p>
-      <w:pPr>
-        <w:rPr>
-          <w:lang w:val="nl-NL"/>
-        </w:rPr>
-      </w:pPr>
-      <w:r>
-        <w:rPr>
-          <w:lang w:val="nl-NL"/>
-        </w:rPr>
-        <w:t>Kleurenpalet (</w:t>
-      </w:r>
-      <w:proofErr w:type="spellStart"/>
-      <w:r>
-        <w:rPr>
-          <w:lang w:val="nl-NL"/>
-        </w:rPr>
-        <w:t>hex</w:t>
-      </w:r>
-      <w:proofErr w:type="spellEnd"/>
-      <w:r>
-        <w:rPr>
-          <w:lang w:val="nl-NL"/>
-        </w:rPr>
-        <w:t xml:space="preserve"> nummers):</w:t>
+      <w:r>
+        <w:rPr>
+          <w:lang w:val="nl-NL"/>
+        </w:rPr>
+        <w:t>betonne barrière met de kleur geel zwart</w:t>
+      </w:r>
+    </w:p>
+    <w:p>
+      <w:pPr>
+        <w:rPr>
+          <w:lang w:val="nl-NL"/>
+        </w:rPr>
+      </w:pPr>
+      <w:r>
+        <w:rPr>
+          <w:lang w:val="nl-NL"/>
+        </w:rPr>
+        <w:t>Kleurenpalet (hex nummers):</w:t>
       </w:r>
     </w:p>
     <w:p>
@@ -6454,18 +5855,19 @@
     <w:p>
       <w:pPr>
         <w:pStyle w:val="Heading2"/>
+        <w:rPr>
+          <w:lang w:val="nl-NL"/>
+        </w:rPr>
       </w:pPr>
       <w:bookmarkStart w:id="21" w:name="_Toc231933178"/>
       <w:r>
+        <w:rPr>
+          <w:lang w:val="nl-NL"/>
+        </w:rPr>
         <w:lastRenderedPageBreak/>
-        <w:t xml:space="preserve">Daan van der </w:t>
-      </w:r>
-      <w:proofErr w:type="spellStart"/>
-      <w:r>
-        <w:t>Greft</w:t>
+        <w:t>Daan van der Greft</w:t>
       </w:r>
       <w:bookmarkEnd w:id="21"/>
-      <w:proofErr w:type="spellEnd"/>
     </w:p>
     <w:p>
       <w:pPr>
@@ -6590,21 +5992,7 @@
         <w:rPr>
           <w:lang w:val="nl-NL"/>
         </w:rPr>
-        <w:t>Kleurenpalet (</w:t>
-      </w:r>
-      <w:proofErr w:type="spellStart"/>
-      <w:r>
-        <w:rPr>
-          <w:lang w:val="nl-NL"/>
-        </w:rPr>
-        <w:t>hex</w:t>
-      </w:r>
-      <w:proofErr w:type="spellEnd"/>
-      <w:r>
-        <w:rPr>
-          <w:lang w:val="nl-NL"/>
-        </w:rPr>
-        <w:t xml:space="preserve"> nummers):</w:t>
+        <w:t>Kleurenpalet (hex nummers):</w:t>
       </w:r>
     </w:p>
     <w:p>
@@ -6709,17 +6097,9 @@
           <w:lang w:val="nl-NL"/>
         </w:rPr>
         <w:lastRenderedPageBreak/>
-        <w:t xml:space="preserve">Tomas </w:t>
-      </w:r>
-      <w:proofErr w:type="spellStart"/>
-      <w:r>
-        <w:rPr>
-          <w:lang w:val="nl-NL"/>
-        </w:rPr>
-        <w:t>Heinst</w:t>
+        <w:t>Tomas Heinst</w:t>
       </w:r>
       <w:bookmarkEnd w:id="22"/>
-      <w:proofErr w:type="spellEnd"/>
     </w:p>
     <w:p>
       <w:pPr>
@@ -6771,21 +6151,7 @@
         <w:rPr>
           <w:lang w:val="nl-NL"/>
         </w:rPr>
-        <w:t>Kleurenpalet (</w:t>
-      </w:r>
-      <w:proofErr w:type="spellStart"/>
-      <w:r>
-        <w:rPr>
-          <w:lang w:val="nl-NL"/>
-        </w:rPr>
-        <w:t>hex</w:t>
-      </w:r>
-      <w:proofErr w:type="spellEnd"/>
-      <w:r>
-        <w:rPr>
-          <w:lang w:val="nl-NL"/>
-        </w:rPr>
-        <w:t xml:space="preserve"> nummers):</w:t>
+        <w:t>Kleurenpalet (hex nummers):</w:t>
       </w:r>
     </w:p>
     <w:p>
@@ -6912,21 +6278,7 @@
         <w:rPr>
           <w:lang w:val="nl-NL"/>
         </w:rPr>
-        <w:t>Kleurenpalet (</w:t>
-      </w:r>
-      <w:proofErr w:type="spellStart"/>
-      <w:r>
-        <w:rPr>
-          <w:lang w:val="nl-NL"/>
-        </w:rPr>
-        <w:t>hex</w:t>
-      </w:r>
-      <w:proofErr w:type="spellEnd"/>
-      <w:r>
-        <w:rPr>
-          <w:lang w:val="nl-NL"/>
-        </w:rPr>
-        <w:t xml:space="preserve"> nummers):</w:t>
+        <w:t>Kleurenpalet (hex nummers):</w:t>
       </w:r>
     </w:p>
     <w:p>
@@ -7053,21 +6405,7 @@
         <w:rPr>
           <w:lang w:val="nl-NL"/>
         </w:rPr>
-        <w:t>Kleurenpalet (</w:t>
-      </w:r>
-      <w:proofErr w:type="spellStart"/>
-      <w:r>
-        <w:rPr>
-          <w:lang w:val="nl-NL"/>
-        </w:rPr>
-        <w:t>hex</w:t>
-      </w:r>
-      <w:proofErr w:type="spellEnd"/>
-      <w:r>
-        <w:rPr>
-          <w:lang w:val="nl-NL"/>
-        </w:rPr>
-        <w:t xml:space="preserve"> nummers):</w:t>
+        <w:t>Kleurenpalet (hex nummers):</w:t>
       </w:r>
     </w:p>
     <w:p>
@@ -7191,12 +6529,13 @@
       </w:pPr>
       <w:r>
         <w:rPr>
+          <w:noProof/>
           <w:lang w:val="nl-NL"/>
         </w:rPr>
         <w:drawing>
-          <wp:inline distT="0" distB="0" distL="0" distR="0" wp14:anchorId="3081B476" wp14:editId="669AFA06">
-            <wp:extent cx="4152900" cy="3028950"/>
-            <wp:effectExtent l="0" t="0" r="0" b="0"/>
+          <wp:inline distT="0" distB="0" distL="0" distR="0" wp14:anchorId="3081B476" wp14:editId="655FD50B">
+            <wp:extent cx="2396881" cy="1165658"/>
+            <wp:effectExtent l="0" t="0" r="3810" b="0"/>
             <wp:docPr id="1090613317" name="Picture 21"/>
             <wp:cNvGraphicFramePr>
               <a:graphicFrameLocks xmlns:a="http://schemas.openxmlformats.org/drawingml/2006/main" noChangeAspect="1"/>
@@ -7210,7 +6549,7 @@
                       <a:picLocks noChangeAspect="1" noChangeArrowheads="1"/>
                     </pic:cNvPicPr>
                   </pic:nvPicPr>
-                  <pic:blipFill>
+                  <pic:blipFill rotWithShape="1">
                     <a:blip r:embed="rId15" cstate="print">
                       <a:extLst>
                         <a:ext uri="{28A0092B-C50C-407E-A947-70E740481C1C}">
@@ -7218,7 +6557,7 @@
                         </a:ext>
                       </a:extLst>
                     </a:blip>
-                    <a:srcRect/>
+                    <a:srcRect l="10028" r="32217" b="61490"/>
                     <a:stretch>
                       <a:fillRect/>
                     </a:stretch>
@@ -7226,7 +6565,7 @@
                   <pic:spPr bwMode="auto">
                     <a:xfrm>
                       <a:off x="0" y="0"/>
-                      <a:ext cx="4152900" cy="3028950"/>
+                      <a:ext cx="2398504" cy="1166447"/>
                     </a:xfrm>
                     <a:prstGeom prst="rect">
                       <a:avLst/>
@@ -7235,6 +6574,11 @@
                     <a:ln>
                       <a:noFill/>
                     </a:ln>
+                    <a:extLst>
+                      <a:ext uri="{53640926-AAD7-44D8-BBD7-CCE9431645EC}">
+                        <a14:shadowObscured xmlns:a14="http://schemas.microsoft.com/office/drawing/2010/main"/>
+                      </a:ext>
+                    </a:extLst>
                   </pic:spPr>
                 </pic:pic>
               </a:graphicData>
@@ -7246,114 +6590,67 @@
     <w:p>
       <w:pPr>
         <w:rPr>
+          <w:lang w:val="nl-NL"/>
+        </w:rPr>
+      </w:pPr>
+      <w:r>
+        <w:rPr>
+          <w:lang w:val="nl-NL"/>
+        </w:rPr>
+        <w:t>Ik wil voor een simpel uitziend huis gaan die natuurlijk door de helft is ingestort.</w:t>
+      </w:r>
+    </w:p>
+    <w:p>
+      <w:pPr>
+        <w:rPr>
           <w:lang w:val="fr-FR"/>
         </w:rPr>
       </w:pPr>
-      <w:proofErr w:type="spellStart"/>
       <w:r>
         <w:rPr>
           <w:lang w:val="fr-FR"/>
         </w:rPr>
-        <w:t>Kleurenpalet</w:t>
-      </w:r>
-      <w:proofErr w:type="spellEnd"/>
-      <w:r>
+        <w:t>Kleurenpalet (hex nummers):</w:t>
+      </w:r>
+    </w:p>
+    <w:p>
+      <w:pPr>
         <w:rPr>
           <w:lang w:val="fr-FR"/>
         </w:rPr>
-        <w:t xml:space="preserve"> (</w:t>
-      </w:r>
-      <w:proofErr w:type="spellStart"/>
+      </w:pPr>
       <w:r>
         <w:rPr>
           <w:lang w:val="fr-FR"/>
         </w:rPr>
-        <w:t>hex</w:t>
-      </w:r>
-      <w:proofErr w:type="spellEnd"/>
-      <w:r>
+        <w:t>AC8655 - Primair</w:t>
+      </w:r>
+    </w:p>
+    <w:p>
+      <w:pPr>
         <w:rPr>
           <w:lang w:val="fr-FR"/>
         </w:rPr>
-        <w:t xml:space="preserve"> </w:t>
-      </w:r>
-      <w:proofErr w:type="spellStart"/>
+      </w:pPr>
       <w:r>
         <w:rPr>
           <w:lang w:val="fr-FR"/>
         </w:rPr>
-        <w:t>nummers</w:t>
-      </w:r>
-      <w:proofErr w:type="spellEnd"/>
-      <w:r>
-        <w:rPr>
-          <w:lang w:val="fr-FR"/>
-        </w:rPr>
-        <w:t>):</w:t>
-      </w:r>
-    </w:p>
-    <w:p>
-      <w:pPr>
-        <w:rPr>
-          <w:lang w:val="fr-FR"/>
-        </w:rPr>
-      </w:pPr>
-      <w:r>
-        <w:rPr>
-          <w:lang w:val="fr-FR"/>
-        </w:rPr>
-        <w:t xml:space="preserve">AC8655 - </w:t>
-      </w:r>
-      <w:proofErr w:type="spellStart"/>
-      <w:r>
-        <w:rPr>
-          <w:lang w:val="fr-FR"/>
-        </w:rPr>
-        <w:t>Primair</w:t>
-      </w:r>
-      <w:proofErr w:type="spellEnd"/>
-    </w:p>
-    <w:p>
-      <w:pPr>
-        <w:rPr>
-          <w:lang w:val="fr-FR"/>
-        </w:rPr>
-      </w:pPr>
-      <w:r>
-        <w:rPr>
-          <w:lang w:val="fr-FR"/>
-        </w:rPr>
-        <w:t xml:space="preserve">4A4A4A - </w:t>
-      </w:r>
-      <w:proofErr w:type="spellStart"/>
-      <w:r>
-        <w:rPr>
-          <w:lang w:val="fr-FR"/>
-        </w:rPr>
-        <w:t>Secundair</w:t>
-      </w:r>
-      <w:proofErr w:type="spellEnd"/>
-    </w:p>
-    <w:p>
-      <w:pPr>
-        <w:rPr>
-          <w:lang w:val="nl-NL"/>
-        </w:rPr>
-      </w:pPr>
-      <w:r>
-        <w:rPr>
-          <w:lang w:val="nl-NL"/>
-        </w:rPr>
-        <w:t xml:space="preserve">F8E71C - </w:t>
-      </w:r>
-      <w:proofErr w:type="spellStart"/>
-      <w:r>
-        <w:rPr>
-          <w:lang w:val="nl-NL"/>
-        </w:rPr>
-        <w:t>Tetriair</w:t>
-      </w:r>
-      <w:proofErr w:type="spellEnd"/>
+        <w:t>4A4A4A - Secundair</w:t>
+      </w:r>
+    </w:p>
+    <w:p>
+      <w:pPr>
+        <w:rPr>
+          <w:lang w:val="nl-NL"/>
+        </w:rPr>
+      </w:pPr>
+      <w:r>
+        <w:rPr>
+          <w:lang w:val="nl-NL"/>
+        </w:rPr>
+        <w:t>F8E71C - Tetriair</w:t>
+      </w:r>
     </w:p>
     <w:p>
       <w:pPr>
@@ -7374,6 +6671,59 @@
           <w:lang w:val="nl-NL"/>
         </w:rPr>
       </w:pPr>
+      <w:r>
+        <w:rPr>
+          <w:lang w:val="nl-NL"/>
+        </w:rPr>
+        <w:drawing>
+          <wp:inline distT="0" distB="0" distL="0" distR="0" wp14:anchorId="7DCDDBE2" wp14:editId="4462A7E5">
+            <wp:extent cx="2476770" cy="2327031"/>
+            <wp:effectExtent l="0" t="0" r="0" b="0"/>
+            <wp:docPr id="1647277349" name="Picture 1"/>
+            <wp:cNvGraphicFramePr>
+              <a:graphicFrameLocks xmlns:a="http://schemas.openxmlformats.org/drawingml/2006/main" noChangeAspect="1"/>
+            </wp:cNvGraphicFramePr>
+            <a:graphic xmlns:a="http://schemas.openxmlformats.org/drawingml/2006/main">
+              <a:graphicData uri="http://schemas.openxmlformats.org/drawingml/2006/picture">
+                <pic:pic xmlns:pic="http://schemas.openxmlformats.org/drawingml/2006/picture">
+                  <pic:nvPicPr>
+                    <pic:cNvPr id="1647277349" name=""/>
+                    <pic:cNvPicPr/>
+                  </pic:nvPicPr>
+                  <pic:blipFill>
+                    <a:blip r:embed="rId16"/>
+                    <a:stretch>
+                      <a:fillRect/>
+                    </a:stretch>
+                  </pic:blipFill>
+                  <pic:spPr>
+                    <a:xfrm>
+                      <a:off x="0" y="0"/>
+                      <a:ext cx="2486466" cy="2336141"/>
+                    </a:xfrm>
+                    <a:prstGeom prst="rect">
+                      <a:avLst/>
+                    </a:prstGeom>
+                  </pic:spPr>
+                </pic:pic>
+              </a:graphicData>
+            </a:graphic>
+          </wp:inline>
+        </w:drawing>
+      </w:r>
+    </w:p>
+    <w:p>
+      <w:pPr>
+        <w:rPr>
+          <w:lang w:val="nl-NL"/>
+        </w:rPr>
+      </w:pPr>
+      <w:r>
+        <w:rPr>
+          <w:lang w:val="nl-NL"/>
+        </w:rPr>
+        <w:t>Dit is het halve huis. De gaten zijn gecreëerd door tankmunitie en het huis is ook daardoor ingestort. Vandaar het puin naast het huis!</w:t>
+      </w:r>
     </w:p>
     <w:p>
       <w:pPr>
@@ -7418,17 +6768,9 @@
           <w:lang w:val="nl-NL"/>
         </w:rPr>
         <w:lastRenderedPageBreak/>
-        <w:t xml:space="preserve">Sam </w:t>
-      </w:r>
-      <w:proofErr w:type="spellStart"/>
-      <w:r>
-        <w:rPr>
-          <w:lang w:val="nl-NL"/>
-        </w:rPr>
-        <w:t>Mujanović</w:t>
+        <w:t>Sam Mujanović</w:t>
       </w:r>
       <w:bookmarkEnd w:id="26"/>
-      <w:proofErr w:type="spellEnd"/>
     </w:p>
     <w:p>
       <w:pPr>
@@ -7470,6 +6812,9 @@
         </w:rPr>
       </w:pPr>
       <w:r>
+        <w:rPr>
+          <w:noProof/>
+        </w:rPr>
         <w:drawing>
           <wp:inline distT="0" distB="0" distL="0" distR="0" wp14:anchorId="0DC861F7" wp14:editId="72EFAE1B">
             <wp:extent cx="5943600" cy="4305300"/>
@@ -7488,7 +6833,7 @@
                     </pic:cNvPicPr>
                   </pic:nvPicPr>
                   <pic:blipFill>
-                    <a:blip r:embed="rId16">
+                    <a:blip r:embed="rId17">
                       <a:extLst>
                         <a:ext uri="{28A0092B-C50C-407E-A947-70E740481C1C}">
                           <a14:useLocalDpi xmlns:a14="http://schemas.microsoft.com/office/drawing/2010/main" val="0"/>
@@ -7544,23 +6889,12 @@
           <w:lang w:val="nl-NL"/>
         </w:rPr>
         <w:lastRenderedPageBreak/>
-        <w:t>Kleurenpalet (</w:t>
-      </w:r>
-      <w:proofErr w:type="spellStart"/>
-      <w:r>
-        <w:rPr>
-          <w:lang w:val="nl-NL"/>
-        </w:rPr>
-        <w:t>hex</w:t>
-      </w:r>
-      <w:proofErr w:type="spellEnd"/>
-      <w:r>
-        <w:rPr>
-          <w:lang w:val="nl-NL"/>
-        </w:rPr>
-        <w:t xml:space="preserve"> nummers):</w:t>
-      </w:r>
-      <w:r>
+        <w:t>Kleurenpalet (hex nummers):</w:t>
+      </w:r>
+      <w:r>
+        <w:rPr>
+          <w:noProof/>
+        </w:rPr>
         <w:drawing>
           <wp:inline distT="0" distB="0" distL="0" distR="0" wp14:anchorId="5B62FDB9" wp14:editId="7B3B986F">
             <wp:extent cx="4089400" cy="3581400"/>
@@ -7579,7 +6913,7 @@
                     </pic:cNvPicPr>
                   </pic:nvPicPr>
                   <pic:blipFill>
-                    <a:blip r:embed="rId17">
+                    <a:blip r:embed="rId18">
                       <a:extLst>
                         <a:ext uri="{28A0092B-C50C-407E-A947-70E740481C1C}">
                           <a14:useLocalDpi xmlns:a14="http://schemas.microsoft.com/office/drawing/2010/main" val="0"/>
@@ -7676,20 +7010,12 @@
         </w:rPr>
       </w:pPr>
       <w:bookmarkStart w:id="27" w:name="_Toc231933184"/>
-      <w:proofErr w:type="spellStart"/>
       <w:r>
         <w:rPr>
           <w:lang w:val="nl-NL"/>
         </w:rPr>
         <w:lastRenderedPageBreak/>
-        <w:t>Mika</w:t>
-      </w:r>
-      <w:proofErr w:type="spellEnd"/>
-      <w:r>
-        <w:rPr>
-          <w:lang w:val="nl-NL"/>
-        </w:rPr>
-        <w:t xml:space="preserve"> Oostveen</w:t>
+        <w:t>Mika Oostveen</w:t>
       </w:r>
       <w:bookmarkEnd w:id="27"/>
     </w:p>
@@ -7703,35 +7029,7 @@
         <w:rPr>
           <w:lang w:val="nl-NL"/>
         </w:rPr>
-        <w:t xml:space="preserve">Asset: </w:t>
-      </w:r>
-      <w:proofErr w:type="spellStart"/>
-      <w:r>
-        <w:rPr>
-          <w:lang w:val="nl-NL"/>
-        </w:rPr>
-        <w:t>Bullets</w:t>
-      </w:r>
-      <w:proofErr w:type="spellEnd"/>
-      <w:r>
-        <w:rPr>
-          <w:lang w:val="nl-NL"/>
-        </w:rPr>
-        <w:t xml:space="preserve"> en </w:t>
-      </w:r>
-      <w:proofErr w:type="spellStart"/>
-      <w:r>
-        <w:rPr>
-          <w:lang w:val="nl-NL"/>
-        </w:rPr>
-        <w:t>bullet</w:t>
-      </w:r>
-      <w:proofErr w:type="spellEnd"/>
-      <w:r>
-        <w:rPr>
-          <w:lang w:val="nl-NL"/>
-        </w:rPr>
-        <w:t xml:space="preserve"> packs</w:t>
+        <w:t>Asset: Bullets en bullet packs</w:t>
       </w:r>
     </w:p>
     <w:p>
@@ -7761,6 +7059,9 @@
         </w:rPr>
       </w:pPr>
       <w:r>
+        <w:rPr>
+          <w:noProof/>
+        </w:rPr>
         <w:drawing>
           <wp:inline distT="0" distB="0" distL="0" distR="0" wp14:anchorId="05598944" wp14:editId="5A16DEF9">
             <wp:extent cx="3841750" cy="2159000"/>
@@ -7779,7 +7080,7 @@
                     </pic:cNvPicPr>
                   </pic:nvPicPr>
                   <pic:blipFill>
-                    <a:blip r:embed="rId18" cstate="print">
+                    <a:blip r:embed="rId19" cstate="print">
                       <a:extLst>
                         <a:ext uri="{28A0092B-C50C-407E-A947-70E740481C1C}">
                           <a14:useLocalDpi xmlns:a14="http://schemas.microsoft.com/office/drawing/2010/main" val="0"/>
@@ -7821,90 +7122,20 @@
         <w:rPr>
           <w:lang w:val="nl-NL"/>
         </w:rPr>
-        <w:t xml:space="preserve">Ik heb hiervoor gekozen omdat het </w:t>
-      </w:r>
-      <w:proofErr w:type="spellStart"/>
-      <w:r>
-        <w:rPr>
-          <w:lang w:val="nl-NL"/>
-        </w:rPr>
-        <w:t>opzich</w:t>
-      </w:r>
-      <w:proofErr w:type="spellEnd"/>
-      <w:r>
-        <w:rPr>
-          <w:lang w:val="nl-NL"/>
-        </w:rPr>
-        <w:t xml:space="preserve"> wel mooi eruit zit (negeer de face op de </w:t>
-      </w:r>
-      <w:proofErr w:type="spellStart"/>
-      <w:r>
-        <w:rPr>
-          <w:lang w:val="nl-NL"/>
-        </w:rPr>
-        <w:t>bullet</w:t>
-      </w:r>
-      <w:proofErr w:type="spellEnd"/>
-      <w:r>
-        <w:rPr>
-          <w:lang w:val="nl-NL"/>
-        </w:rPr>
-        <w:t xml:space="preserve"> ik bedoel de </w:t>
-      </w:r>
-      <w:proofErr w:type="spellStart"/>
-      <w:r>
-        <w:rPr>
-          <w:lang w:val="nl-NL"/>
-        </w:rPr>
-        <w:t>shape</w:t>
-      </w:r>
-      <w:proofErr w:type="spellEnd"/>
-      <w:r>
-        <w:rPr>
-          <w:lang w:val="nl-NL"/>
-        </w:rPr>
-        <w:t xml:space="preserve"> </w:t>
-      </w:r>
-      <w:proofErr w:type="spellStart"/>
-      <w:r>
-        <w:rPr>
-          <w:lang w:val="nl-NL"/>
-        </w:rPr>
-        <w:t>itself</w:t>
-      </w:r>
-      <w:proofErr w:type="spellEnd"/>
-      <w:r>
-        <w:rPr>
-          <w:lang w:val="nl-NL"/>
-        </w:rPr>
-        <w:t xml:space="preserve">) </w:t>
-      </w:r>
-    </w:p>
-    <w:p>
-      <w:pPr>
-        <w:rPr>
-          <w:lang w:val="nl-NL"/>
-        </w:rPr>
-      </w:pPr>
-      <w:r>
-        <w:rPr>
-          <w:lang w:val="nl-NL"/>
-        </w:rPr>
-        <w:t>Kleurenpalet (</w:t>
-      </w:r>
-      <w:proofErr w:type="spellStart"/>
-      <w:r>
-        <w:rPr>
-          <w:lang w:val="nl-NL"/>
-        </w:rPr>
-        <w:t>hex</w:t>
-      </w:r>
-      <w:proofErr w:type="spellEnd"/>
-      <w:r>
-        <w:rPr>
-          <w:lang w:val="nl-NL"/>
-        </w:rPr>
-        <w:t xml:space="preserve"> nummers):</w:t>
+        <w:t xml:space="preserve">Ik heb hiervoor gekozen omdat het opzich wel mooi eruit zit (negeer de face op de bullet ik bedoel de shape itself) </w:t>
+      </w:r>
+    </w:p>
+    <w:p>
+      <w:pPr>
+        <w:rPr>
+          <w:lang w:val="nl-NL"/>
+        </w:rPr>
+      </w:pPr>
+      <w:r>
+        <w:rPr>
+          <w:lang w:val="nl-NL"/>
+        </w:rPr>
+        <w:t>Kleurenpalet (hex nummers):</w:t>
       </w:r>
       <w:r>
         <w:rPr>
@@ -8067,21 +7298,7 @@
         <w:rPr>
           <w:lang w:val="nl-NL"/>
         </w:rPr>
-        <w:t>Kleurenpalet (</w:t>
-      </w:r>
-      <w:proofErr w:type="spellStart"/>
-      <w:r>
-        <w:rPr>
-          <w:lang w:val="nl-NL"/>
-        </w:rPr>
-        <w:t>hex</w:t>
-      </w:r>
-      <w:proofErr w:type="spellEnd"/>
-      <w:r>
-        <w:rPr>
-          <w:lang w:val="nl-NL"/>
-        </w:rPr>
-        <w:t xml:space="preserve"> nummers):</w:t>
+        <w:t>Kleurenpalet (hex nummers):</w:t>
       </w:r>
     </w:p>
     <w:p>
@@ -8192,6 +7409,7 @@
       </w:r>
       <w:r>
         <w:rPr>
+          <w:noProof/>
           <w:lang w:val="nl-NL"/>
         </w:rPr>
         <w:drawing>
@@ -8212,7 +7430,7 @@
                     </pic:cNvPicPr>
                   </pic:nvPicPr>
                   <pic:blipFill>
-                    <a:blip r:embed="rId19">
+                    <a:blip r:embed="rId20">
                       <a:extLst>
                         <a:ext uri="{28A0092B-C50C-407E-A947-70E740481C1C}">
                           <a14:useLocalDpi xmlns:a14="http://schemas.microsoft.com/office/drawing/2010/main" val="0"/>
@@ -8279,39 +7497,11 @@
       </w:pPr>
     </w:p>
     <w:p>
-      <w:pPr>
-        <w:rPr>
-          <w:lang w:val="nl-NL"/>
-        </w:rPr>
-      </w:pPr>
-      <w:r>
-        <w:rPr>
-          <w:lang w:val="nl-NL"/>
-        </w:rPr>
-        <w:t>Kleurenpalet (</w:t>
-      </w:r>
-      <w:proofErr w:type="spellStart"/>
-      <w:r>
-        <w:rPr>
-          <w:lang w:val="nl-NL"/>
-        </w:rPr>
-        <w:t>hex</w:t>
-      </w:r>
-      <w:proofErr w:type="spellEnd"/>
-      <w:r>
-        <w:rPr>
-          <w:lang w:val="nl-NL"/>
-        </w:rPr>
-        <w:t xml:space="preserve"> nummers): F5A623 4A4A4A 000000</w:t>
-      </w:r>
-    </w:p>
-    <w:p>
-      <w:pPr>
-        <w:rPr>
-          <w:lang w:val="nl-NL"/>
-        </w:rPr>
-      </w:pPr>
-    </w:p>
+      <w:r>
+        <w:t>Kleurenpalet (hex nummers): F5A623 4A4A4A 000000</w:t>
+      </w:r>
+    </w:p>
+    <w:p/>
     <w:p>
       <w:pPr>
         <w:rPr>
@@ -8345,9 +7535,15 @@
         <w:t>Feedback klasgenoot:</w:t>
       </w:r>
     </w:p>
-    <w:p/>
+    <w:p>
+      <w:pPr>
+        <w:rPr>
+          <w:lang w:val="nl-NL"/>
+        </w:rPr>
+      </w:pPr>
+    </w:p>
     <w:sectPr>
-      <w:footerReference w:type="default" r:id="rId20"/>
+      <w:footerReference w:type="default" r:id="rId21"/>
       <w:pgSz w:w="12240" w:h="15840"/>
       <w:pgMar w:top="1440" w:right="1440" w:bottom="1440" w:left="1440" w:header="720" w:footer="720" w:gutter="0"/>
       <w:pgNumType w:start="0"/>
@@ -13971,6 +13167,7 @@
   <w:style w:type="character" w:default="1" w:styleId="DefaultParagraphFont">
     <w:name w:val="Default Paragraph Font"/>
     <w:uiPriority w:val="1"/>
+    <w:semiHidden/>
     <w:unhideWhenUsed/>
   </w:style>
   <w:style w:type="table" w:default="1" w:styleId="TableNormal">
@@ -14742,32 +13939,6 @@
 </file>
 
 <file path=customXml/item1.xml><?xml version="1.0" encoding="utf-8"?>
-<b:Sources xmlns:b="http://schemas.openxmlformats.org/officeDocument/2006/bibliography" xmlns="http://schemas.openxmlformats.org/officeDocument/2006/bibliography" SelectedStyle="\APASixthEditionOfficeOnline.xsl" StyleName="APA" Version="6"/>
-</file>
-
-<file path=customXml/item2.xml><?xml version="1.0" encoding="utf-8"?>
-<?mso-contentType ?>
-<FormTemplates xmlns="http://schemas.microsoft.com/sharepoint/v3/contenttype/forms">
-  <Display>DocumentLibraryForm</Display>
-  <Edit>DocumentLibraryForm</Edit>
-  <New>DocumentLibraryForm</New>
-</FormTemplates>
-</file>
-
-<file path=customXml/item3.xml><?xml version="1.0" encoding="utf-8"?>
-<p:properties xmlns:p="http://schemas.microsoft.com/office/2006/metadata/properties" xmlns:xsi="http://www.w3.org/2001/XMLSchema-instance" xmlns:pc="http://schemas.microsoft.com/office/infopath/2007/PartnerControls">
-  <documentManagement>
-    <TaxCatchAll xmlns="8902adb9-d5ab-4519-807d-4f8787b35b14" xsi:nil="true"/>
-    <lcf76f155ced4ddcb4097134ff3c332f xmlns="3bb2d62f-9cf3-41e4-8e26-dc347878987c">
-      <Terms xmlns="http://schemas.microsoft.com/office/infopath/2007/PartnerControls"/>
-    </lcf76f155ced4ddcb4097134ff3c332f>
-    <opmerking xmlns="3bb2d62f-9cf3-41e4-8e26-dc347878987c" xsi:nil="true"/>
-    <Date xmlns="3bb2d62f-9cf3-41e4-8e26-dc347878987c" xsi:nil="true"/>
-  </documentManagement>
-</p:properties>
-</file>
-
-<file path=customXml/item4.xml><?xml version="1.0" encoding="utf-8"?>
 <ct:contentTypeSchema xmlns:ct="http://schemas.microsoft.com/office/2006/metadata/contentType" xmlns:ma="http://schemas.microsoft.com/office/2006/metadata/properties/metaAttributes" ct:_="" ma:_="" ma:contentTypeName="Document" ma:contentTypeID="0x01010081721797C5860640AD6427A9C39167B1" ma:contentTypeVersion="21" ma:contentTypeDescription="Een nieuw document maken." ma:contentTypeScope="" ma:versionID="e1344a081ab0ba3a5a6874a830e2f4b9">
   <xsd:schema xmlns:xsd="http://www.w3.org/2001/XMLSchema" xmlns:xs="http://www.w3.org/2001/XMLSchema" xmlns:p="http://schemas.microsoft.com/office/2006/metadata/properties" xmlns:ns2="3bb2d62f-9cf3-41e4-8e26-dc347878987c" xmlns:ns3="8902adb9-d5ab-4519-807d-4f8787b35b14" targetNamespace="http://schemas.microsoft.com/office/2006/metadata/properties" ma:root="true" ma:fieldsID="15f697695118f6a7513fe898790b7107" ns2:_="" ns3:_="">
     <xsd:import namespace="3bb2d62f-9cf3-41e4-8e26-dc347878987c"/>
@@ -15042,34 +14213,33 @@
 </ct:contentTypeSchema>
 </file>
 
-<file path=customXml/itemProps1.xml><?xml version="1.0" encoding="utf-8"?>
-<ds:datastoreItem xmlns:ds="http://schemas.openxmlformats.org/officeDocument/2006/customXml" ds:itemID="{2D17A913-F597-48A7-9E0A-898CD165CDA8}">
-  <ds:schemaRefs>
-    <ds:schemaRef ds:uri="http://schemas.openxmlformats.org/officeDocument/2006/bibliography"/>
-  </ds:schemaRefs>
-</ds:datastoreItem>
+<file path=customXml/item2.xml><?xml version="1.0" encoding="utf-8"?>
+<p:properties xmlns:p="http://schemas.microsoft.com/office/2006/metadata/properties" xmlns:xsi="http://www.w3.org/2001/XMLSchema-instance" xmlns:pc="http://schemas.microsoft.com/office/infopath/2007/PartnerControls">
+  <documentManagement>
+    <TaxCatchAll xmlns="8902adb9-d5ab-4519-807d-4f8787b35b14" xsi:nil="true"/>
+    <lcf76f155ced4ddcb4097134ff3c332f xmlns="3bb2d62f-9cf3-41e4-8e26-dc347878987c">
+      <Terms xmlns="http://schemas.microsoft.com/office/infopath/2007/PartnerControls"/>
+    </lcf76f155ced4ddcb4097134ff3c332f>
+    <opmerking xmlns="3bb2d62f-9cf3-41e4-8e26-dc347878987c" xsi:nil="true"/>
+    <Date xmlns="3bb2d62f-9cf3-41e4-8e26-dc347878987c" xsi:nil="true"/>
+  </documentManagement>
+</p:properties>
 </file>
 
-<file path=customXml/itemProps2.xml><?xml version="1.0" encoding="utf-8"?>
-<ds:datastoreItem xmlns:ds="http://schemas.openxmlformats.org/officeDocument/2006/customXml" ds:itemID="{3E366E4C-E0B2-4C13-A3ED-F3EEBE4D371C}">
-  <ds:schemaRefs>
-    <ds:schemaRef ds:uri="http://schemas.microsoft.com/sharepoint/v3/contenttype/forms"/>
-  </ds:schemaRefs>
-</ds:datastoreItem>
+<file path=customXml/item3.xml><?xml version="1.0" encoding="utf-8"?>
+<?mso-contentType ?>
+<FormTemplates xmlns="http://schemas.microsoft.com/sharepoint/v3/contenttype/forms">
+  <Display>DocumentLibraryForm</Display>
+  <Edit>DocumentLibraryForm</Edit>
+  <New>DocumentLibraryForm</New>
+</FormTemplates>
 </file>
 
-<file path=customXml/itemProps3.xml><?xml version="1.0" encoding="utf-8"?>
-<ds:datastoreItem xmlns:ds="http://schemas.openxmlformats.org/officeDocument/2006/customXml" ds:itemID="{811D0D50-5177-409B-95A0-602D3D2FD0EE}">
-  <ds:schemaRefs>
-    <ds:schemaRef ds:uri="http://schemas.microsoft.com/office/2006/metadata/properties"/>
-    <ds:schemaRef ds:uri="http://schemas.microsoft.com/office/infopath/2007/PartnerControls"/>
-    <ds:schemaRef ds:uri="8902adb9-d5ab-4519-807d-4f8787b35b14"/>
-    <ds:schemaRef ds:uri="3bb2d62f-9cf3-41e4-8e26-dc347878987c"/>
-  </ds:schemaRefs>
-</ds:datastoreItem>
+<file path=customXml/item4.xml><?xml version="1.0" encoding="utf-8"?>
+<b:Sources xmlns:b="http://schemas.openxmlformats.org/officeDocument/2006/bibliography" xmlns="http://schemas.openxmlformats.org/officeDocument/2006/bibliography" SelectedStyle="\APASixthEditionOfficeOnline.xsl" StyleName="APA" Version="6"/>
 </file>
 
-<file path=customXml/itemProps4.xml><?xml version="1.0" encoding="utf-8"?>
+<file path=customXml/itemProps1.xml><?xml version="1.0" encoding="utf-8"?>
 <ds:datastoreItem xmlns:ds="http://schemas.openxmlformats.org/officeDocument/2006/customXml" ds:itemID="{CFF707F2-E3F0-497D-9DFC-10E434143D17}">
   <ds:schemaRefs>
     <ds:schemaRef ds:uri="http://schemas.microsoft.com/office/2006/metadata/contentType"/>
@@ -15086,4 +14256,31 @@
     <ds:schemaRef ds:uri="http://schemas.microsoft.com/internal/obd"/>
   </ds:schemaRefs>
 </ds:datastoreItem>
+</file>
+
+<file path=customXml/itemProps2.xml><?xml version="1.0" encoding="utf-8"?>
+<ds:datastoreItem xmlns:ds="http://schemas.openxmlformats.org/officeDocument/2006/customXml" ds:itemID="{811D0D50-5177-409B-95A0-602D3D2FD0EE}">
+  <ds:schemaRefs>
+    <ds:schemaRef ds:uri="http://schemas.microsoft.com/office/2006/metadata/properties"/>
+    <ds:schemaRef ds:uri="http://schemas.microsoft.com/office/infopath/2007/PartnerControls"/>
+    <ds:schemaRef ds:uri="8902adb9-d5ab-4519-807d-4f8787b35b14"/>
+    <ds:schemaRef ds:uri="3bb2d62f-9cf3-41e4-8e26-dc347878987c"/>
+  </ds:schemaRefs>
+</ds:datastoreItem>
+</file>
+
+<file path=customXml/itemProps3.xml><?xml version="1.0" encoding="utf-8"?>
+<ds:datastoreItem xmlns:ds="http://schemas.openxmlformats.org/officeDocument/2006/customXml" ds:itemID="{3E366E4C-E0B2-4C13-A3ED-F3EEBE4D371C}">
+  <ds:schemaRefs>
+    <ds:schemaRef ds:uri="http://schemas.microsoft.com/sharepoint/v3/contenttype/forms"/>
+  </ds:schemaRefs>
+</ds:datastoreItem>
+</file>
+
+<file path=customXml/itemProps4.xml><?xml version="1.0" encoding="utf-8"?>
+<ds:datastoreItem xmlns:ds="http://schemas.openxmlformats.org/officeDocument/2006/customXml" ds:itemID="{2D17A913-F597-48A7-9E0A-898CD165CDA8}">
+  <ds:schemaRefs>
+    <ds:schemaRef ds:uri="http://schemas.openxmlformats.org/officeDocument/2006/bibliography"/>
+  </ds:schemaRefs>
+</ds:datastoreItem>
 </file>
</xml_diff>